<commit_message>
Documentation individuelle : fiches professionnelles des 6 membres
Page de garde, en-tête et numéros de page, 8 sections : contexte,
outils d'IA générative, méthode, journal des prompts daté,
justification du modèle avec tableau comparatif, gains de
productivité, bonnes pratiques et conclusion.
Fiche de Khadija Ben Ayed (M2) rédigée ; les 5 autres pré-remplies
avec les résultats de leur module, journal à compléter par chacun.

Co-Authored-By: Claude Opus 5.5 <noreply@anthropic.com>
</commit_message>
<xml_diff>
--- a/docs/documentation-individuelle/Documentation-individuelle-Aziz-Dlissi.docx
+++ b/docs/documentation-individuelle/Documentation-individuelle-Aziz-Dlissi.docx
@@ -2,6 +2,10 @@
 <file path=word/document.xml><?xml version="1.0" encoding="utf-8"?>
 <w:document xmlns:wpc="http://schemas.microsoft.com/office/word/2010/wordprocessingCanvas" xmlns:mo="http://schemas.microsoft.com/office/mac/office/2008/main" xmlns:mc="http://schemas.openxmlformats.org/markup-compatibility/2006" xmlns:mv="urn:schemas-microsoft-com:mac:vml" xmlns:o="urn:schemas-microsoft-com:office:office" xmlns:r="http://schemas.openxmlformats.org/officeDocument/2006/relationships" xmlns:m="http://schemas.openxmlformats.org/officeDocument/2006/math" xmlns:v="urn:schemas-microsoft-com:vml" xmlns:wp14="http://schemas.microsoft.com/office/word/2010/wordprocessingDrawing" xmlns:wp="http://schemas.openxmlformats.org/drawingml/2006/wordprocessingDrawing" xmlns:w10="urn:schemas-microsoft-com:office:word" xmlns:w="http://schemas.openxmlformats.org/wordprocessingml/2006/main" xmlns:w14="http://schemas.microsoft.com/office/word/2010/wordml" xmlns:wpg="http://schemas.microsoft.com/office/word/2010/wordprocessingGroup" xmlns:wpi="http://schemas.microsoft.com/office/word/2010/wordprocessingInk" xmlns:wne="http://schemas.microsoft.com/office/word/2006/wordml" xmlns:wps="http://schemas.microsoft.com/office/word/2010/wordprocessingShape" mc:Ignorable="w14 wp14">
   <w:body>
+    <w:p/>
+    <w:p/>
+    <w:p/>
+    <w:p/>
     <w:p>
       <w:pPr>
         <w:jc w:val="center"/>
@@ -9,10 +13,25 @@
       <w:r>
         <w:rPr>
           <w:b/>
+          <w:color w:val="A07F1F"/>
+          <w:sz w:val="22"/>
+        </w:rPr>
+        <w:t>ESPRIT · IA FOR SOFTWARE ENGINEERING</w:t>
+      </w:r>
+    </w:p>
+    <w:p>
+      <w:pPr>
+        <w:spacing w:before="360"/>
+        <w:jc w:val="center"/>
+      </w:pPr>
+      <w:r>
+        <w:rPr>
+          <w:rFonts w:ascii="Cambria" w:hAnsi="Cambria"/>
+          <w:b/>
           <w:color w:val="3D4F1C"/>
-          <w:sz w:val="36"/>
+          <w:sz w:val="60"/>
         </w:rPr>
-        <w:t>Zitouna AI — Documentation individuelle</w:t>
+        <w:t>Documentation individuelle</w:t>
       </w:r>
     </w:p>
     <w:p>
@@ -20,41 +39,91 @@
         <w:jc w:val="center"/>
       </w:pPr>
       <w:r>
-        <w:t>IA for Software Engineering · ESPRIT · 5SAE10 · 2026 – 2027</w:t>
+        <w:rPr>
+          <w:color w:val="1D2214"/>
+          <w:sz w:val="28"/>
+        </w:rPr>
+        <w:t>Usage de l’IA générative, prompts et justification du modèle</w:t>
       </w:r>
     </w:p>
+    <w:p>
+      <w:pPr>
+        <w:spacing w:before="600"/>
+        <w:jc w:val="center"/>
+      </w:pPr>
+      <w:r>
+        <w:rPr>
+          <w:rFonts w:ascii="Cambria" w:hAnsi="Cambria"/>
+          <w:b/>
+          <w:color w:val="1D2214"/>
+          <w:sz w:val="44"/>
+        </w:rPr>
+        <w:t>Aziz Dlissi</w:t>
+      </w:r>
+    </w:p>
+    <w:p>
+      <w:pPr>
+        <w:jc w:val="center"/>
+      </w:pPr>
+      <w:r>
+        <w:rPr>
+          <w:color w:val="3D4F1C"/>
+          <w:sz w:val="26"/>
+        </w:rPr>
+        <w:t>M6 · Comptage des oliviers</w:t>
+      </w:r>
+    </w:p>
+    <w:p/>
+    <w:p/>
+    <w:p/>
     <w:tbl>
       <w:tblPr>
         <w:tblStyle w:val="TableGrid"/>
         <w:tblW w:type="auto" w:w="0"/>
+        <w:jc w:val="center"/>
         <w:tblLook w:firstColumn="1" w:firstRow="1" w:lastColumn="0" w:lastRow="0" w:noHBand="0" w:noVBand="1" w:val="04A0"/>
       </w:tblPr>
       <w:tblGrid>
-        <w:gridCol w:w="4320"/>
-        <w:gridCol w:w="4320"/>
+        <w:gridCol w:w="4706"/>
+        <w:gridCol w:w="4706"/>
       </w:tblGrid>
       <w:tr>
         <w:tc>
           <w:tcPr>
-            <w:tcW w:type="dxa" w:w="4320"/>
+            <w:tcW w:type="dxa" w:w="2835"/>
             <w:shd w:val="clear" w:color="auto" w:fill="E8EDD9"/>
           </w:tcPr>
           <w:p>
+            <w:pPr>
+              <w:spacing w:after="0"/>
+            </w:pPr>
+            <w:r/>
             <w:r>
               <w:rPr>
                 <w:b/>
+                <w:i w:val="0"/>
+                <w:sz w:val="20"/>
               </w:rPr>
-              <w:t>Membre</w:t>
+              <w:t>Projet</w:t>
             </w:r>
           </w:p>
         </w:tc>
         <w:tc>
           <w:tcPr>
-            <w:tcW w:type="dxa" w:w="4320"/>
+            <w:tcW w:type="dxa" w:w="5953"/>
           </w:tcPr>
           <w:p>
+            <w:pPr>
+              <w:spacing w:after="0"/>
+            </w:pPr>
+            <w:r/>
             <w:r>
-              <w:t>Aziz Dlissi</w:t>
+              <w:rPr>
+                <w:b w:val="0"/>
+                <w:i w:val="0"/>
+                <w:sz w:val="20"/>
+              </w:rPr>
+              <w:t>Zitouna AI — plateforme d’IA pour les petits oléiculteurs tunisiens</w:t>
             </w:r>
           </w:p>
         </w:tc>
@@ -62,39 +131,19 @@
       <w:tr>
         <w:tc>
           <w:tcPr>
-            <w:tcW w:type="dxa" w:w="4320"/>
+            <w:tcW w:type="dxa" w:w="2835"/>
             <w:shd w:val="clear" w:color="auto" w:fill="E8EDD9"/>
           </w:tcPr>
           <w:p>
+            <w:pPr>
+              <w:spacing w:after="0"/>
+            </w:pPr>
+            <w:r/>
             <w:r>
               <w:rPr>
                 <w:b/>
-              </w:rPr>
-              <w:t>Module d’IA</w:t>
-            </w:r>
-          </w:p>
-        </w:tc>
-        <w:tc>
-          <w:tcPr>
-            <w:tcW w:type="dxa" w:w="4320"/>
-          </w:tcPr>
-          <w:p>
-            <w:r>
-              <w:t>M6 · Comptage des oliviers</w:t>
-            </w:r>
-          </w:p>
-        </w:tc>
-      </w:tr>
-      <w:tr>
-        <w:tc>
-          <w:tcPr>
-            <w:tcW w:type="dxa" w:w="4320"/>
-            <w:shd w:val="clear" w:color="auto" w:fill="E8EDD9"/>
-          </w:tcPr>
-          <w:p>
-            <w:r>
-              <w:rPr>
-                <w:b/>
+                <w:i w:val="0"/>
+                <w:sz w:val="20"/>
               </w:rPr>
               <w:t>Rôle transversal</w:t>
             </w:r>
@@ -102,10 +151,19 @@
         </w:tc>
         <w:tc>
           <w:tcPr>
-            <w:tcW w:type="dxa" w:w="4320"/>
+            <w:tcW w:type="dxa" w:w="5953"/>
           </w:tcPr>
           <w:p>
+            <w:pPr>
+              <w:spacing w:after="0"/>
+            </w:pPr>
+            <w:r/>
             <w:r>
+              <w:rPr>
+                <w:b w:val="0"/>
+                <w:i w:val="0"/>
+                <w:sz w:val="20"/>
+              </w:rPr>
               <w:t>Docker et déploiement</w:t>
             </w:r>
           </w:p>
@@ -114,13 +172,60 @@
       <w:tr>
         <w:tc>
           <w:tcPr>
-            <w:tcW w:type="dxa" w:w="4320"/>
+            <w:tcW w:type="dxa" w:w="2835"/>
             <w:shd w:val="clear" w:color="auto" w:fill="E8EDD9"/>
           </w:tcPr>
           <w:p>
+            <w:pPr>
+              <w:spacing w:after="0"/>
+            </w:pPr>
+            <w:r/>
             <w:r>
               <w:rPr>
                 <w:b/>
+                <w:i w:val="0"/>
+                <w:sz w:val="20"/>
+              </w:rPr>
+              <w:t>Classe</w:t>
+            </w:r>
+          </w:p>
+        </w:tc>
+        <w:tc>
+          <w:tcPr>
+            <w:tcW w:type="dxa" w:w="5953"/>
+          </w:tcPr>
+          <w:p>
+            <w:pPr>
+              <w:spacing w:after="0"/>
+            </w:pPr>
+            <w:r/>
+            <w:r>
+              <w:rPr>
+                <w:b w:val="0"/>
+                <w:i w:val="0"/>
+                <w:sz w:val="20"/>
+              </w:rPr>
+              <w:t>5SAE10</w:t>
+            </w:r>
+          </w:p>
+        </w:tc>
+      </w:tr>
+      <w:tr>
+        <w:tc>
+          <w:tcPr>
+            <w:tcW w:type="dxa" w:w="2835"/>
+            <w:shd w:val="clear" w:color="auto" w:fill="E8EDD9"/>
+          </w:tcPr>
+          <w:p>
+            <w:pPr>
+              <w:spacing w:after="0"/>
+            </w:pPr>
+            <w:r/>
+            <w:r>
+              <w:rPr>
+                <w:b/>
+                <w:i w:val="0"/>
+                <w:sz w:val="20"/>
               </w:rPr>
               <w:t>Encadrant</w:t>
             </w:r>
@@ -128,11 +233,61 @@
         </w:tc>
         <w:tc>
           <w:tcPr>
-            <w:tcW w:type="dxa" w:w="4320"/>
+            <w:tcW w:type="dxa" w:w="5953"/>
           </w:tcPr>
           <w:p>
+            <w:pPr>
+              <w:spacing w:after="0"/>
+            </w:pPr>
+            <w:r/>
             <w:r>
+              <w:rPr>
+                <w:b w:val="0"/>
+                <w:i w:val="0"/>
+                <w:sz w:val="20"/>
+              </w:rPr>
               <w:t>Khemiri Akram</w:t>
+            </w:r>
+          </w:p>
+        </w:tc>
+      </w:tr>
+      <w:tr>
+        <w:tc>
+          <w:tcPr>
+            <w:tcW w:type="dxa" w:w="2835"/>
+            <w:shd w:val="clear" w:color="auto" w:fill="E8EDD9"/>
+          </w:tcPr>
+          <w:p>
+            <w:pPr>
+              <w:spacing w:after="0"/>
+            </w:pPr>
+            <w:r/>
+            <w:r>
+              <w:rPr>
+                <w:b/>
+                <w:i w:val="0"/>
+                <w:sz w:val="20"/>
+              </w:rPr>
+              <w:t>Année universitaire</w:t>
+            </w:r>
+          </w:p>
+        </w:tc>
+        <w:tc>
+          <w:tcPr>
+            <w:tcW w:type="dxa" w:w="5953"/>
+          </w:tcPr>
+          <w:p>
+            <w:pPr>
+              <w:spacing w:after="0"/>
+            </w:pPr>
+            <w:r/>
+            <w:r>
+              <w:rPr>
+                <w:b w:val="0"/>
+                <w:i w:val="0"/>
+                <w:sz w:val="20"/>
+              </w:rPr>
+              <w:t>2026 – 2027</w:t>
             </w:r>
           </w:p>
         </w:tc>
@@ -140,68 +295,459 @@
     </w:tbl>
     <w:p>
       <w:r>
-        <w:rPr>
-          <w:b/>
-          <w:color w:val="3D4F1C"/>
-          <w:sz w:val="26"/>
-        </w:rPr>
-        <w:t>1. Outils d’IA générative utilisés</w:t>
+        <w:br w:type="page"/>
       </w:r>
     </w:p>
     <w:p>
+      <w:pPr>
+        <w:pStyle w:val="Heading1"/>
+      </w:pPr>
       <w:r>
-        <w:t>À compléter : outils utilisés (Claude, Copilot, ChatGPT…) et pour quelles tâches.</w:t>
+        <w:t>1. Contexte et rôle</w:t>
       </w:r>
     </w:p>
     <w:p>
+      <w:pPr>
+        <w:spacing w:after="120"/>
+      </w:pPr>
       <w:r>
         <w:rPr>
-          <w:b/>
-          <w:color w:val="3D4F1C"/>
-          <w:sz w:val="26"/>
+          <w:i w:val="0"/>
         </w:rPr>
-        <w:t>2. Journal des prompts et des interactions avec les LLM</w:t>
+        <w:t>Dans le projet Zitouna AI, j’ai porté le module M6 · Comptage des oliviers de bout en bout : données, modèle, service FastAPI, intégration dans l’application et écran. Type d’IA : Vision par ordinateur · détection d’objets. Rôle transversal : Docker et déploiement.</w:t>
+      </w:r>
+    </w:p>
+    <w:p>
+      <w:pPr>
+        <w:pStyle w:val="Heading1"/>
+      </w:pPr>
+      <w:r>
+        <w:t>2. Outils d’IA générative utilisés</w:t>
+      </w:r>
+    </w:p>
+    <w:p>
+      <w:pPr>
+        <w:spacing w:after="120"/>
+      </w:pPr>
+      <w:r>
+        <w:rPr>
+          <w:i/>
+          <w:color w:val="8A8E7D"/>
+        </w:rPr>
+        <w:t>À compléter — indiquer les outils utilisés (Claude, Copilot, ChatGPT…) et pour quelles tâches.</w:t>
       </w:r>
     </w:p>
     <w:tbl>
       <w:tblPr>
         <w:tblStyle w:val="TableGrid"/>
         <w:tblW w:type="auto" w:w="0"/>
+        <w:jc w:val="center"/>
+        <w:tblLayout w:type="fixed"/>
         <w:tblLook w:firstColumn="1" w:firstRow="1" w:lastColumn="0" w:lastRow="0" w:noHBand="0" w:noVBand="1" w:val="04A0"/>
       </w:tblPr>
       <w:tblGrid>
-        <w:gridCol w:w="2880"/>
-        <w:gridCol w:w="2880"/>
-        <w:gridCol w:w="2880"/>
+        <w:gridCol w:w="3137"/>
+        <w:gridCol w:w="3137"/>
+        <w:gridCol w:w="3137"/>
       </w:tblGrid>
       <w:tr>
+        <w:trPr>
+          <w:tblHeader w:val="true"/>
+        </w:trPr>
         <w:tc>
           <w:tcPr>
-            <w:tcW w:type="dxa" w:w="2880"/>
+            <w:tcW w:type="dxa" w:w="2381"/>
             <w:shd w:val="clear" w:color="auto" w:fill="3D4F1C"/>
           </w:tcPr>
           <w:p>
+            <w:pPr>
+              <w:spacing w:after="0"/>
+            </w:pPr>
             <w:r/>
             <w:r>
               <w:rPr>
                 <w:b/>
+                <w:i w:val="0"/>
                 <w:color w:val="FFFFFF"/>
+                <w:sz w:val="20"/>
               </w:rPr>
-              <w:t>Prompt envoyé</w:t>
+              <w:t>Outil</w:t>
             </w:r>
           </w:p>
         </w:tc>
         <w:tc>
           <w:tcPr>
-            <w:tcW w:type="dxa" w:w="2880"/>
+            <w:tcW w:type="dxa" w:w="2835"/>
             <w:shd w:val="clear" w:color="auto" w:fill="3D4F1C"/>
           </w:tcPr>
           <w:p>
+            <w:pPr>
+              <w:spacing w:after="0"/>
+            </w:pPr>
             <w:r/>
             <w:r>
               <w:rPr>
                 <w:b/>
+                <w:i w:val="0"/>
                 <w:color w:val="FFFFFF"/>
+                <w:sz w:val="20"/>
+              </w:rPr>
+              <w:t>Nature</w:t>
+            </w:r>
+          </w:p>
+        </w:tc>
+        <w:tc>
+          <w:tcPr>
+            <w:tcW w:type="dxa" w:w="4195"/>
+            <w:shd w:val="clear" w:color="auto" w:fill="3D4F1C"/>
+          </w:tcPr>
+          <w:p>
+            <w:pPr>
+              <w:spacing w:after="0"/>
+            </w:pPr>
+            <w:r/>
+            <w:r>
+              <w:rPr>
+                <w:b/>
+                <w:i w:val="0"/>
+                <w:color w:val="FFFFFF"/>
+                <w:sz w:val="20"/>
+              </w:rPr>
+              <w:t>Usage</w:t>
+            </w:r>
+          </w:p>
+        </w:tc>
+      </w:tr>
+      <w:tr>
+        <w:tc>
+          <w:tcPr>
+            <w:tcW w:type="dxa" w:w="2381"/>
+          </w:tcPr>
+          <w:p>
+            <w:pPr>
+              <w:spacing w:after="0"/>
+            </w:pPr>
+            <w:r/>
+            <w:r>
+              <w:rPr>
+                <w:b w:val="0"/>
+                <w:i/>
+                <w:color w:val="8A8E7D"/>
+                <w:sz w:val="20"/>
+              </w:rPr>
+              <w:t>…</w:t>
+            </w:r>
+          </w:p>
+        </w:tc>
+        <w:tc>
+          <w:tcPr>
+            <w:tcW w:type="dxa" w:w="2835"/>
+          </w:tcPr>
+          <w:p>
+            <w:pPr>
+              <w:spacing w:after="0"/>
+            </w:pPr>
+            <w:r/>
+            <w:r>
+              <w:rPr>
+                <w:b w:val="0"/>
+                <w:i/>
+                <w:color w:val="8A8E7D"/>
+                <w:sz w:val="20"/>
+              </w:rPr>
+              <w:t>…</w:t>
+            </w:r>
+          </w:p>
+        </w:tc>
+        <w:tc>
+          <w:tcPr>
+            <w:tcW w:type="dxa" w:w="4195"/>
+          </w:tcPr>
+          <w:p>
+            <w:pPr>
+              <w:spacing w:after="0"/>
+            </w:pPr>
+            <w:r/>
+            <w:r>
+              <w:rPr>
+                <w:b w:val="0"/>
+                <w:i/>
+                <w:color w:val="8A8E7D"/>
+                <w:sz w:val="20"/>
+              </w:rPr>
+              <w:t>…</w:t>
+            </w:r>
+          </w:p>
+        </w:tc>
+      </w:tr>
+      <w:tr>
+        <w:tc>
+          <w:tcPr>
+            <w:tcW w:type="dxa" w:w="2381"/>
+          </w:tcPr>
+          <w:p>
+            <w:pPr>
+              <w:spacing w:after="0"/>
+            </w:pPr>
+            <w:r/>
+            <w:r>
+              <w:rPr>
+                <w:b w:val="0"/>
+                <w:i/>
+                <w:color w:val="8A8E7D"/>
+                <w:sz w:val="20"/>
+              </w:rPr>
+              <w:t>…</w:t>
+            </w:r>
+          </w:p>
+        </w:tc>
+        <w:tc>
+          <w:tcPr>
+            <w:tcW w:type="dxa" w:w="2835"/>
+          </w:tcPr>
+          <w:p>
+            <w:pPr>
+              <w:spacing w:after="0"/>
+            </w:pPr>
+            <w:r/>
+            <w:r>
+              <w:rPr>
+                <w:b w:val="0"/>
+                <w:i/>
+                <w:color w:val="8A8E7D"/>
+                <w:sz w:val="20"/>
+              </w:rPr>
+              <w:t>…</w:t>
+            </w:r>
+          </w:p>
+        </w:tc>
+        <w:tc>
+          <w:tcPr>
+            <w:tcW w:type="dxa" w:w="4195"/>
+          </w:tcPr>
+          <w:p>
+            <w:pPr>
+              <w:spacing w:after="0"/>
+            </w:pPr>
+            <w:r/>
+            <w:r>
+              <w:rPr>
+                <w:b w:val="0"/>
+                <w:i/>
+                <w:color w:val="8A8E7D"/>
+                <w:sz w:val="20"/>
+              </w:rPr>
+              <w:t>…</w:t>
+            </w:r>
+          </w:p>
+        </w:tc>
+      </w:tr>
+      <w:tr>
+        <w:tc>
+          <w:tcPr>
+            <w:tcW w:type="dxa" w:w="2381"/>
+          </w:tcPr>
+          <w:p>
+            <w:pPr>
+              <w:spacing w:after="0"/>
+            </w:pPr>
+            <w:r/>
+            <w:r>
+              <w:rPr>
+                <w:b w:val="0"/>
+                <w:i/>
+                <w:color w:val="8A8E7D"/>
+                <w:sz w:val="20"/>
+              </w:rPr>
+              <w:t>…</w:t>
+            </w:r>
+          </w:p>
+        </w:tc>
+        <w:tc>
+          <w:tcPr>
+            <w:tcW w:type="dxa" w:w="2835"/>
+          </w:tcPr>
+          <w:p>
+            <w:pPr>
+              <w:spacing w:after="0"/>
+            </w:pPr>
+            <w:r/>
+            <w:r>
+              <w:rPr>
+                <w:b w:val="0"/>
+                <w:i/>
+                <w:color w:val="8A8E7D"/>
+                <w:sz w:val="20"/>
+              </w:rPr>
+              <w:t>…</w:t>
+            </w:r>
+          </w:p>
+        </w:tc>
+        <w:tc>
+          <w:tcPr>
+            <w:tcW w:type="dxa" w:w="4195"/>
+          </w:tcPr>
+          <w:p>
+            <w:pPr>
+              <w:spacing w:after="0"/>
+            </w:pPr>
+            <w:r/>
+            <w:r>
+              <w:rPr>
+                <w:b w:val="0"/>
+                <w:i/>
+                <w:color w:val="8A8E7D"/>
+                <w:sz w:val="20"/>
+              </w:rPr>
+              <w:t>…</w:t>
+            </w:r>
+          </w:p>
+        </w:tc>
+      </w:tr>
+    </w:tbl>
+    <w:p>
+      <w:pPr>
+        <w:spacing w:after="40"/>
+      </w:pPr>
+    </w:p>
+    <w:p>
+      <w:pPr>
+        <w:pStyle w:val="Heading1"/>
+      </w:pPr>
+      <w:r>
+        <w:t>3. Méthode de travail avec l’IA</w:t>
+      </w:r>
+    </w:p>
+    <w:p>
+      <w:pPr>
+        <w:spacing w:after="120"/>
+      </w:pPr>
+      <w:r>
+        <w:rPr>
+          <w:i/>
+          <w:color w:val="8A8E7D"/>
+        </w:rPr>
+        <w:t>À compléter — décrire comment vous avez formulé vos demandes à l’IA et comment vous avez vérifié ses réponses.</w:t>
+      </w:r>
+    </w:p>
+    <w:p>
+      <w:pPr>
+        <w:pStyle w:val="Heading1"/>
+      </w:pPr>
+      <w:r>
+        <w:t>4. Journal des prompts et des interactions</w:t>
+      </w:r>
+    </w:p>
+    <w:p>
+      <w:pPr>
+        <w:spacing w:after="120"/>
+      </w:pPr>
+      <w:r>
+        <w:rPr>
+          <w:i/>
+          <w:color w:val="8A8E7D"/>
+        </w:rPr>
+        <w:t>À compléter — pour chaque échange important : la date, l’objectif, le prompt exact, ce que l’IA a répondu ou fait, et comment vous l’avez vérifié ou corrigé.</w:t>
+      </w:r>
+    </w:p>
+    <w:tbl>
+      <w:tblPr>
+        <w:tblStyle w:val="TableGrid"/>
+        <w:tblW w:type="auto" w:w="0"/>
+        <w:jc w:val="center"/>
+        <w:tblLayout w:type="fixed"/>
+        <w:tblLook w:firstColumn="1" w:firstRow="1" w:lastColumn="0" w:lastRow="0" w:noHBand="0" w:noVBand="1" w:val="04A0"/>
+      </w:tblPr>
+      <w:tblGrid>
+        <w:gridCol w:w="1882"/>
+        <w:gridCol w:w="1882"/>
+        <w:gridCol w:w="1882"/>
+        <w:gridCol w:w="1882"/>
+        <w:gridCol w:w="1882"/>
+      </w:tblGrid>
+      <w:tr>
+        <w:trPr>
+          <w:tblHeader w:val="true"/>
+        </w:trPr>
+        <w:tc>
+          <w:tcPr>
+            <w:tcW w:type="dxa" w:w="1361"/>
+            <w:shd w:val="clear" w:color="auto" w:fill="3D4F1C"/>
+          </w:tcPr>
+          <w:p>
+            <w:pPr>
+              <w:spacing w:after="0"/>
+            </w:pPr>
+            <w:r/>
+            <w:r>
+              <w:rPr>
+                <w:b/>
+                <w:i w:val="0"/>
+                <w:color w:val="FFFFFF"/>
+                <w:sz w:val="20"/>
+              </w:rPr>
+              <w:t>Date</w:t>
+            </w:r>
+          </w:p>
+        </w:tc>
+        <w:tc>
+          <w:tcPr>
+            <w:tcW w:type="dxa" w:w="1191"/>
+            <w:shd w:val="clear" w:color="auto" w:fill="3D4F1C"/>
+          </w:tcPr>
+          <w:p>
+            <w:pPr>
+              <w:spacing w:after="0"/>
+            </w:pPr>
+            <w:r/>
+            <w:r>
+              <w:rPr>
+                <w:b/>
+                <w:i w:val="0"/>
+                <w:color w:val="FFFFFF"/>
+                <w:sz w:val="20"/>
+              </w:rPr>
+              <w:t>Objectif</w:t>
+            </w:r>
+          </w:p>
+        </w:tc>
+        <w:tc>
+          <w:tcPr>
+            <w:tcW w:type="dxa" w:w="2381"/>
+            <w:shd w:val="clear" w:color="auto" w:fill="3D4F1C"/>
+          </w:tcPr>
+          <w:p>
+            <w:pPr>
+              <w:spacing w:after="0"/>
+            </w:pPr>
+            <w:r/>
+            <w:r>
+              <w:rPr>
+                <w:b/>
+                <w:i w:val="0"/>
+                <w:color w:val="FFFFFF"/>
+                <w:sz w:val="20"/>
+              </w:rPr>
+              <w:t>Prompt</w:t>
+            </w:r>
+          </w:p>
+        </w:tc>
+        <w:tc>
+          <w:tcPr>
+            <w:tcW w:type="dxa" w:w="2438"/>
+            <w:shd w:val="clear" w:color="auto" w:fill="3D4F1C"/>
+          </w:tcPr>
+          <w:p>
+            <w:pPr>
+              <w:spacing w:after="0"/>
+            </w:pPr>
+            <w:r/>
+            <w:r>
+              <w:rPr>
+                <w:b/>
+                <w:i w:val="0"/>
+                <w:color w:val="FFFFFF"/>
+                <w:sz w:val="20"/>
               </w:rPr>
               <w:t>Réponse / action de l’IA</w:t>
             </w:r>
@@ -209,17 +755,22 @@
         </w:tc>
         <w:tc>
           <w:tcPr>
-            <w:tcW w:type="dxa" w:w="2880"/>
+            <w:tcW w:type="dxa" w:w="2041"/>
             <w:shd w:val="clear" w:color="auto" w:fill="3D4F1C"/>
           </w:tcPr>
           <w:p>
+            <w:pPr>
+              <w:spacing w:after="0"/>
+            </w:pPr>
             <w:r/>
             <w:r>
               <w:rPr>
                 <w:b/>
+                <w:i w:val="0"/>
                 <w:color w:val="FFFFFF"/>
+                <w:sz w:val="20"/>
               </w:rPr>
-              <w:t>Ce que j’ai gardé, corrigé et vérifié</w:t>
+              <w:t>Vérification</w:t>
             </w:r>
           </w:p>
         </w:tc>
@@ -227,198 +778,1173 @@
       <w:tr>
         <w:tc>
           <w:tcPr>
-            <w:tcW w:type="dxa" w:w="2880"/>
+            <w:tcW w:type="dxa" w:w="1361"/>
           </w:tcPr>
           <w:p>
+            <w:pPr>
+              <w:spacing w:after="0"/>
+            </w:pPr>
             <w:r/>
+            <w:r>
+              <w:rPr>
+                <w:b w:val="0"/>
+                <w:i/>
+                <w:color w:val="8A8E7D"/>
+                <w:sz w:val="20"/>
+              </w:rPr>
+              <w:t>…</w:t>
+            </w:r>
           </w:p>
         </w:tc>
         <w:tc>
           <w:tcPr>
-            <w:tcW w:type="dxa" w:w="2880"/>
+            <w:tcW w:type="dxa" w:w="1191"/>
           </w:tcPr>
           <w:p>
+            <w:pPr>
+              <w:spacing w:after="0"/>
+            </w:pPr>
             <w:r/>
+            <w:r>
+              <w:rPr>
+                <w:b w:val="0"/>
+                <w:i/>
+                <w:color w:val="8A8E7D"/>
+                <w:sz w:val="20"/>
+              </w:rPr>
+              <w:t>…</w:t>
+            </w:r>
           </w:p>
         </w:tc>
         <w:tc>
           <w:tcPr>
-            <w:tcW w:type="dxa" w:w="2880"/>
+            <w:tcW w:type="dxa" w:w="2381"/>
           </w:tcPr>
           <w:p>
+            <w:pPr>
+              <w:spacing w:after="0"/>
+            </w:pPr>
             <w:r/>
+            <w:r>
+              <w:rPr>
+                <w:b w:val="0"/>
+                <w:i/>
+                <w:color w:val="8A8E7D"/>
+                <w:sz w:val="20"/>
+              </w:rPr>
+              <w:t>…</w:t>
+            </w:r>
+          </w:p>
+        </w:tc>
+        <w:tc>
+          <w:tcPr>
+            <w:tcW w:type="dxa" w:w="2438"/>
+          </w:tcPr>
+          <w:p>
+            <w:pPr>
+              <w:spacing w:after="0"/>
+            </w:pPr>
+            <w:r/>
+            <w:r>
+              <w:rPr>
+                <w:b w:val="0"/>
+                <w:i/>
+                <w:color w:val="8A8E7D"/>
+                <w:sz w:val="20"/>
+              </w:rPr>
+              <w:t>…</w:t>
+            </w:r>
+          </w:p>
+        </w:tc>
+        <w:tc>
+          <w:tcPr>
+            <w:tcW w:type="dxa" w:w="2041"/>
+          </w:tcPr>
+          <w:p>
+            <w:pPr>
+              <w:spacing w:after="0"/>
+            </w:pPr>
+            <w:r/>
+            <w:r>
+              <w:rPr>
+                <w:b w:val="0"/>
+                <w:i/>
+                <w:color w:val="8A8E7D"/>
+                <w:sz w:val="20"/>
+              </w:rPr>
+              <w:t>…</w:t>
+            </w:r>
           </w:p>
         </w:tc>
       </w:tr>
       <w:tr>
         <w:tc>
           <w:tcPr>
-            <w:tcW w:type="dxa" w:w="2880"/>
+            <w:tcW w:type="dxa" w:w="1361"/>
           </w:tcPr>
           <w:p>
+            <w:pPr>
+              <w:spacing w:after="0"/>
+            </w:pPr>
             <w:r/>
+            <w:r>
+              <w:rPr>
+                <w:b w:val="0"/>
+                <w:i/>
+                <w:color w:val="8A8E7D"/>
+                <w:sz w:val="20"/>
+              </w:rPr>
+              <w:t>…</w:t>
+            </w:r>
           </w:p>
         </w:tc>
         <w:tc>
           <w:tcPr>
-            <w:tcW w:type="dxa" w:w="2880"/>
+            <w:tcW w:type="dxa" w:w="1191"/>
           </w:tcPr>
           <w:p>
+            <w:pPr>
+              <w:spacing w:after="0"/>
+            </w:pPr>
             <w:r/>
+            <w:r>
+              <w:rPr>
+                <w:b w:val="0"/>
+                <w:i/>
+                <w:color w:val="8A8E7D"/>
+                <w:sz w:val="20"/>
+              </w:rPr>
+              <w:t>…</w:t>
+            </w:r>
           </w:p>
         </w:tc>
         <w:tc>
           <w:tcPr>
-            <w:tcW w:type="dxa" w:w="2880"/>
+            <w:tcW w:type="dxa" w:w="2381"/>
           </w:tcPr>
           <w:p>
+            <w:pPr>
+              <w:spacing w:after="0"/>
+            </w:pPr>
             <w:r/>
+            <w:r>
+              <w:rPr>
+                <w:b w:val="0"/>
+                <w:i/>
+                <w:color w:val="8A8E7D"/>
+                <w:sz w:val="20"/>
+              </w:rPr>
+              <w:t>…</w:t>
+            </w:r>
+          </w:p>
+        </w:tc>
+        <w:tc>
+          <w:tcPr>
+            <w:tcW w:type="dxa" w:w="2438"/>
+          </w:tcPr>
+          <w:p>
+            <w:pPr>
+              <w:spacing w:after="0"/>
+            </w:pPr>
+            <w:r/>
+            <w:r>
+              <w:rPr>
+                <w:b w:val="0"/>
+                <w:i/>
+                <w:color w:val="8A8E7D"/>
+                <w:sz w:val="20"/>
+              </w:rPr>
+              <w:t>…</w:t>
+            </w:r>
+          </w:p>
+        </w:tc>
+        <w:tc>
+          <w:tcPr>
+            <w:tcW w:type="dxa" w:w="2041"/>
+          </w:tcPr>
+          <w:p>
+            <w:pPr>
+              <w:spacing w:after="0"/>
+            </w:pPr>
+            <w:r/>
+            <w:r>
+              <w:rPr>
+                <w:b w:val="0"/>
+                <w:i/>
+                <w:color w:val="8A8E7D"/>
+                <w:sz w:val="20"/>
+              </w:rPr>
+              <w:t>…</w:t>
+            </w:r>
           </w:p>
         </w:tc>
       </w:tr>
       <w:tr>
         <w:tc>
           <w:tcPr>
-            <w:tcW w:type="dxa" w:w="2880"/>
+            <w:tcW w:type="dxa" w:w="1361"/>
           </w:tcPr>
           <w:p>
+            <w:pPr>
+              <w:spacing w:after="0"/>
+            </w:pPr>
             <w:r/>
+            <w:r>
+              <w:rPr>
+                <w:b w:val="0"/>
+                <w:i/>
+                <w:color w:val="8A8E7D"/>
+                <w:sz w:val="20"/>
+              </w:rPr>
+              <w:t>…</w:t>
+            </w:r>
           </w:p>
         </w:tc>
         <w:tc>
           <w:tcPr>
-            <w:tcW w:type="dxa" w:w="2880"/>
+            <w:tcW w:type="dxa" w:w="1191"/>
           </w:tcPr>
           <w:p>
+            <w:pPr>
+              <w:spacing w:after="0"/>
+            </w:pPr>
             <w:r/>
+            <w:r>
+              <w:rPr>
+                <w:b w:val="0"/>
+                <w:i/>
+                <w:color w:val="8A8E7D"/>
+                <w:sz w:val="20"/>
+              </w:rPr>
+              <w:t>…</w:t>
+            </w:r>
           </w:p>
         </w:tc>
         <w:tc>
           <w:tcPr>
-            <w:tcW w:type="dxa" w:w="2880"/>
+            <w:tcW w:type="dxa" w:w="2381"/>
           </w:tcPr>
           <w:p>
+            <w:pPr>
+              <w:spacing w:after="0"/>
+            </w:pPr>
             <w:r/>
+            <w:r>
+              <w:rPr>
+                <w:b w:val="0"/>
+                <w:i/>
+                <w:color w:val="8A8E7D"/>
+                <w:sz w:val="20"/>
+              </w:rPr>
+              <w:t>…</w:t>
+            </w:r>
+          </w:p>
+        </w:tc>
+        <w:tc>
+          <w:tcPr>
+            <w:tcW w:type="dxa" w:w="2438"/>
+          </w:tcPr>
+          <w:p>
+            <w:pPr>
+              <w:spacing w:after="0"/>
+            </w:pPr>
+            <w:r/>
+            <w:r>
+              <w:rPr>
+                <w:b w:val="0"/>
+                <w:i/>
+                <w:color w:val="8A8E7D"/>
+                <w:sz w:val="20"/>
+              </w:rPr>
+              <w:t>…</w:t>
+            </w:r>
+          </w:p>
+        </w:tc>
+        <w:tc>
+          <w:tcPr>
+            <w:tcW w:type="dxa" w:w="2041"/>
+          </w:tcPr>
+          <w:p>
+            <w:pPr>
+              <w:spacing w:after="0"/>
+            </w:pPr>
+            <w:r/>
+            <w:r>
+              <w:rPr>
+                <w:b w:val="0"/>
+                <w:i/>
+                <w:color w:val="8A8E7D"/>
+                <w:sz w:val="20"/>
+              </w:rPr>
+              <w:t>…</w:t>
+            </w:r>
           </w:p>
         </w:tc>
       </w:tr>
       <w:tr>
         <w:tc>
           <w:tcPr>
-            <w:tcW w:type="dxa" w:w="2880"/>
+            <w:tcW w:type="dxa" w:w="1361"/>
           </w:tcPr>
           <w:p>
+            <w:pPr>
+              <w:spacing w:after="0"/>
+            </w:pPr>
             <w:r/>
+            <w:r>
+              <w:rPr>
+                <w:b w:val="0"/>
+                <w:i/>
+                <w:color w:val="8A8E7D"/>
+                <w:sz w:val="20"/>
+              </w:rPr>
+              <w:t>…</w:t>
+            </w:r>
           </w:p>
         </w:tc>
         <w:tc>
           <w:tcPr>
-            <w:tcW w:type="dxa" w:w="2880"/>
+            <w:tcW w:type="dxa" w:w="1191"/>
           </w:tcPr>
           <w:p>
+            <w:pPr>
+              <w:spacing w:after="0"/>
+            </w:pPr>
             <w:r/>
+            <w:r>
+              <w:rPr>
+                <w:b w:val="0"/>
+                <w:i/>
+                <w:color w:val="8A8E7D"/>
+                <w:sz w:val="20"/>
+              </w:rPr>
+              <w:t>…</w:t>
+            </w:r>
           </w:p>
         </w:tc>
         <w:tc>
           <w:tcPr>
-            <w:tcW w:type="dxa" w:w="2880"/>
+            <w:tcW w:type="dxa" w:w="2381"/>
           </w:tcPr>
           <w:p>
+            <w:pPr>
+              <w:spacing w:after="0"/>
+            </w:pPr>
             <w:r/>
+            <w:r>
+              <w:rPr>
+                <w:b w:val="0"/>
+                <w:i/>
+                <w:color w:val="8A8E7D"/>
+                <w:sz w:val="20"/>
+              </w:rPr>
+              <w:t>…</w:t>
+            </w:r>
+          </w:p>
+        </w:tc>
+        <w:tc>
+          <w:tcPr>
+            <w:tcW w:type="dxa" w:w="2438"/>
+          </w:tcPr>
+          <w:p>
+            <w:pPr>
+              <w:spacing w:after="0"/>
+            </w:pPr>
+            <w:r/>
+            <w:r>
+              <w:rPr>
+                <w:b w:val="0"/>
+                <w:i/>
+                <w:color w:val="8A8E7D"/>
+                <w:sz w:val="20"/>
+              </w:rPr>
+              <w:t>…</w:t>
+            </w:r>
+          </w:p>
+        </w:tc>
+        <w:tc>
+          <w:tcPr>
+            <w:tcW w:type="dxa" w:w="2041"/>
+          </w:tcPr>
+          <w:p>
+            <w:pPr>
+              <w:spacing w:after="0"/>
+            </w:pPr>
+            <w:r/>
+            <w:r>
+              <w:rPr>
+                <w:b w:val="0"/>
+                <w:i/>
+                <w:color w:val="8A8E7D"/>
+                <w:sz w:val="20"/>
+              </w:rPr>
+              <w:t>…</w:t>
+            </w:r>
           </w:p>
         </w:tc>
       </w:tr>
       <w:tr>
         <w:tc>
           <w:tcPr>
-            <w:tcW w:type="dxa" w:w="2880"/>
+            <w:tcW w:type="dxa" w:w="1361"/>
           </w:tcPr>
           <w:p>
+            <w:pPr>
+              <w:spacing w:after="0"/>
+            </w:pPr>
             <w:r/>
+            <w:r>
+              <w:rPr>
+                <w:b w:val="0"/>
+                <w:i/>
+                <w:color w:val="8A8E7D"/>
+                <w:sz w:val="20"/>
+              </w:rPr>
+              <w:t>…</w:t>
+            </w:r>
           </w:p>
         </w:tc>
         <w:tc>
           <w:tcPr>
-            <w:tcW w:type="dxa" w:w="2880"/>
+            <w:tcW w:type="dxa" w:w="1191"/>
           </w:tcPr>
           <w:p>
+            <w:pPr>
+              <w:spacing w:after="0"/>
+            </w:pPr>
             <w:r/>
+            <w:r>
+              <w:rPr>
+                <w:b w:val="0"/>
+                <w:i/>
+                <w:color w:val="8A8E7D"/>
+                <w:sz w:val="20"/>
+              </w:rPr>
+              <w:t>…</w:t>
+            </w:r>
           </w:p>
         </w:tc>
         <w:tc>
           <w:tcPr>
-            <w:tcW w:type="dxa" w:w="2880"/>
+            <w:tcW w:type="dxa" w:w="2381"/>
           </w:tcPr>
           <w:p>
+            <w:pPr>
+              <w:spacing w:after="0"/>
+            </w:pPr>
             <w:r/>
+            <w:r>
+              <w:rPr>
+                <w:b w:val="0"/>
+                <w:i/>
+                <w:color w:val="8A8E7D"/>
+                <w:sz w:val="20"/>
+              </w:rPr>
+              <w:t>…</w:t>
+            </w:r>
+          </w:p>
+        </w:tc>
+        <w:tc>
+          <w:tcPr>
+            <w:tcW w:type="dxa" w:w="2438"/>
+          </w:tcPr>
+          <w:p>
+            <w:pPr>
+              <w:spacing w:after="0"/>
+            </w:pPr>
+            <w:r/>
+            <w:r>
+              <w:rPr>
+                <w:b w:val="0"/>
+                <w:i/>
+                <w:color w:val="8A8E7D"/>
+                <w:sz w:val="20"/>
+              </w:rPr>
+              <w:t>…</w:t>
+            </w:r>
+          </w:p>
+        </w:tc>
+        <w:tc>
+          <w:tcPr>
+            <w:tcW w:type="dxa" w:w="2041"/>
+          </w:tcPr>
+          <w:p>
+            <w:pPr>
+              <w:spacing w:after="0"/>
+            </w:pPr>
+            <w:r/>
+            <w:r>
+              <w:rPr>
+                <w:b w:val="0"/>
+                <w:i/>
+                <w:color w:val="8A8E7D"/>
+                <w:sz w:val="20"/>
+              </w:rPr>
+              <w:t>…</w:t>
+            </w:r>
           </w:p>
         </w:tc>
       </w:tr>
       <w:tr>
         <w:tc>
           <w:tcPr>
-            <w:tcW w:type="dxa" w:w="2880"/>
+            <w:tcW w:type="dxa" w:w="1361"/>
           </w:tcPr>
           <w:p>
+            <w:pPr>
+              <w:spacing w:after="0"/>
+            </w:pPr>
             <w:r/>
+            <w:r>
+              <w:rPr>
+                <w:b w:val="0"/>
+                <w:i/>
+                <w:color w:val="8A8E7D"/>
+                <w:sz w:val="20"/>
+              </w:rPr>
+              <w:t>…</w:t>
+            </w:r>
           </w:p>
         </w:tc>
         <w:tc>
           <w:tcPr>
-            <w:tcW w:type="dxa" w:w="2880"/>
+            <w:tcW w:type="dxa" w:w="1191"/>
           </w:tcPr>
           <w:p>
+            <w:pPr>
+              <w:spacing w:after="0"/>
+            </w:pPr>
             <w:r/>
+            <w:r>
+              <w:rPr>
+                <w:b w:val="0"/>
+                <w:i/>
+                <w:color w:val="8A8E7D"/>
+                <w:sz w:val="20"/>
+              </w:rPr>
+              <w:t>…</w:t>
+            </w:r>
           </w:p>
         </w:tc>
         <w:tc>
           <w:tcPr>
-            <w:tcW w:type="dxa" w:w="2880"/>
+            <w:tcW w:type="dxa" w:w="2381"/>
           </w:tcPr>
           <w:p>
+            <w:pPr>
+              <w:spacing w:after="0"/>
+            </w:pPr>
             <w:r/>
+            <w:r>
+              <w:rPr>
+                <w:b w:val="0"/>
+                <w:i/>
+                <w:color w:val="8A8E7D"/>
+                <w:sz w:val="20"/>
+              </w:rPr>
+              <w:t>…</w:t>
+            </w:r>
+          </w:p>
+        </w:tc>
+        <w:tc>
+          <w:tcPr>
+            <w:tcW w:type="dxa" w:w="2438"/>
+          </w:tcPr>
+          <w:p>
+            <w:pPr>
+              <w:spacing w:after="0"/>
+            </w:pPr>
+            <w:r/>
+            <w:r>
+              <w:rPr>
+                <w:b w:val="0"/>
+                <w:i/>
+                <w:color w:val="8A8E7D"/>
+                <w:sz w:val="20"/>
+              </w:rPr>
+              <w:t>…</w:t>
+            </w:r>
+          </w:p>
+        </w:tc>
+        <w:tc>
+          <w:tcPr>
+            <w:tcW w:type="dxa" w:w="2041"/>
+          </w:tcPr>
+          <w:p>
+            <w:pPr>
+              <w:spacing w:after="0"/>
+            </w:pPr>
+            <w:r/>
+            <w:r>
+              <w:rPr>
+                <w:b w:val="0"/>
+                <w:i/>
+                <w:color w:val="8A8E7D"/>
+                <w:sz w:val="20"/>
+              </w:rPr>
+              <w:t>…</w:t>
+            </w:r>
           </w:p>
         </w:tc>
       </w:tr>
     </w:tbl>
     <w:p>
+      <w:pPr>
+        <w:spacing w:after="40"/>
+      </w:pPr>
+    </w:p>
+    <w:p>
+      <w:pPr>
+        <w:pStyle w:val="Heading1"/>
+      </w:pPr>
+      <w:r>
+        <w:t>5. Justification du modèle d’IA choisi</w:t>
+      </w:r>
+    </w:p>
+    <w:tbl>
+      <w:tblPr>
+        <w:tblStyle w:val="TableGrid"/>
+        <w:tblW w:type="auto" w:w="0"/>
+        <w:jc w:val="center"/>
+        <w:tblLayout w:type="fixed"/>
+        <w:tblLook w:firstColumn="1" w:firstRow="1" w:lastColumn="0" w:lastRow="0" w:noHBand="0" w:noVBand="1" w:val="04A0"/>
+      </w:tblPr>
+      <w:tblGrid>
+        <w:gridCol w:w="4706"/>
+        <w:gridCol w:w="4706"/>
+      </w:tblGrid>
+      <w:tr>
+        <w:trPr>
+          <w:tblHeader w:val="true"/>
+        </w:trPr>
+        <w:tc>
+          <w:tcPr>
+            <w:tcW w:type="dxa" w:w="4876"/>
+            <w:shd w:val="clear" w:color="auto" w:fill="3D4F1C"/>
+          </w:tcPr>
+          <w:p>
+            <w:pPr>
+              <w:spacing w:after="0"/>
+            </w:pPr>
+            <w:r/>
+            <w:r>
+              <w:rPr>
+                <w:b/>
+                <w:i w:val="0"/>
+                <w:color w:val="FFFFFF"/>
+                <w:sz w:val="20"/>
+              </w:rPr>
+              <w:t>Modèle comparé</w:t>
+            </w:r>
+          </w:p>
+        </w:tc>
+        <w:tc>
+          <w:tcPr>
+            <w:tcW w:type="dxa" w:w="4535"/>
+            <w:shd w:val="clear" w:color="auto" w:fill="3D4F1C"/>
+          </w:tcPr>
+          <w:p>
+            <w:pPr>
+              <w:spacing w:after="0"/>
+            </w:pPr>
+            <w:r/>
+            <w:r>
+              <w:rPr>
+                <w:b/>
+                <w:i w:val="0"/>
+                <w:color w:val="FFFFFF"/>
+                <w:sz w:val="20"/>
+              </w:rPr>
+              <w:t>Résultat sur les données de test</w:t>
+            </w:r>
+          </w:p>
+        </w:tc>
+      </w:tr>
+      <w:tr>
+        <w:tc>
+          <w:tcPr>
+            <w:tcW w:type="dxa" w:w="4876"/>
+          </w:tcPr>
+          <w:p>
+            <w:pPr>
+              <w:spacing w:after="0"/>
+            </w:pPr>
+            <w:r/>
+            <w:r>
+              <w:rPr>
+                <w:b w:val="0"/>
+                <w:i w:val="0"/>
+                <w:sz w:val="20"/>
+              </w:rPr>
+              <w:t>Détecteur OpenCV (modèle retenu)</w:t>
+            </w:r>
+          </w:p>
+        </w:tc>
+        <w:tc>
+          <w:tcPr>
+            <w:tcW w:type="dxa" w:w="4535"/>
+          </w:tcPr>
+          <w:p>
+            <w:pPr>
+              <w:spacing w:after="0"/>
+            </w:pPr>
+            <w:r/>
+            <w:r>
+              <w:rPr>
+                <w:b w:val="0"/>
+                <w:i w:val="0"/>
+                <w:sz w:val="20"/>
+              </w:rPr>
+              <w:t>296 arbres trouvés sur 296 (6 vergers de test)</w:t>
+            </w:r>
+          </w:p>
+        </w:tc>
+      </w:tr>
+      <w:tr>
+        <w:tc>
+          <w:tcPr>
+            <w:tcW w:type="dxa" w:w="4876"/>
+            <w:shd w:val="clear" w:color="auto" w:fill="F1F3E8"/>
+          </w:tcPr>
+          <w:p>
+            <w:pPr>
+              <w:spacing w:after="0"/>
+            </w:pPr>
+            <w:r/>
+            <w:r>
+              <w:rPr>
+                <w:b w:val="0"/>
+                <w:i w:val="0"/>
+                <w:sz w:val="20"/>
+              </w:rPr>
+              <w:t>YOLOv8 sur OliveTreeCrownsDb</w:t>
+            </w:r>
+          </w:p>
+        </w:tc>
+        <w:tc>
+          <w:tcPr>
+            <w:tcW w:type="dxa" w:w="4535"/>
+            <w:shd w:val="clear" w:color="auto" w:fill="F1F3E8"/>
+          </w:tcPr>
+          <w:p>
+            <w:pPr>
+              <w:spacing w:after="0"/>
+            </w:pPr>
+            <w:r/>
+            <w:r>
+              <w:rPr>
+                <w:b w:val="0"/>
+                <w:i w:val="0"/>
+                <w:sz w:val="20"/>
+              </w:rPr>
+              <w:t>Prévu en suite (mAP@0.5)</w:t>
+            </w:r>
+          </w:p>
+        </w:tc>
+      </w:tr>
+    </w:tbl>
+    <w:p>
+      <w:pPr>
+        <w:spacing w:after="40"/>
+      </w:pPr>
+    </w:p>
+    <w:p>
+      <w:pPr>
+        <w:spacing w:after="120"/>
+      </w:pPr>
       <w:r>
         <w:rPr>
-          <w:b/>
-          <w:color w:val="3D4F1C"/>
-          <w:sz w:val="26"/>
+          <w:i w:val="0"/>
         </w:rPr>
-        <w:t>3. Justification du modèle choisi</w:t>
+        <w:t>La méthode classique OpenCV, référence prévue par le plan, ne demande ni données d’entraînement ni GPU et sépare les couronnes qui se touchent grâce à la transformée de distance.</w:t>
       </w:r>
     </w:p>
     <w:p>
+      <w:pPr>
+        <w:pStyle w:val="Heading1"/>
+      </w:pPr>
       <w:r>
-        <w:t>Méthode classique OpenCV retenue comme référence du plan : sans données d’entraînement ni GPU, elle trouve les 296 arbres de six vergers de test, couronnes collées comprises ; YOLOv8 est prévu en suite.</w:t>
+        <w:t>6. Gains de productivité</w:t>
       </w:r>
     </w:p>
     <w:p>
+      <w:pPr>
+        <w:spacing w:after="120"/>
+      </w:pPr>
       <w:r>
         <w:rPr>
-          <w:b/>
-          <w:color w:val="3D4F1C"/>
-          <w:sz w:val="26"/>
+          <w:i/>
+          <w:color w:val="8A8E7D"/>
         </w:rPr>
-        <w:t>4. Gain de productivité et limites de l’IA</w:t>
+        <w:t>À compléter — les tâches que l’IA a accélérées, avec un exemple concret, et ses limites.</w:t>
+      </w:r>
+    </w:p>
+    <w:tbl>
+      <w:tblPr>
+        <w:tblStyle w:val="TableGrid"/>
+        <w:tblW w:type="auto" w:w="0"/>
+        <w:jc w:val="center"/>
+        <w:tblLayout w:type="fixed"/>
+        <w:tblLook w:firstColumn="1" w:firstRow="1" w:lastColumn="0" w:lastRow="0" w:noHBand="0" w:noVBand="1" w:val="04A0"/>
+      </w:tblPr>
+      <w:tblGrid>
+        <w:gridCol w:w="3137"/>
+        <w:gridCol w:w="3137"/>
+        <w:gridCol w:w="3137"/>
+      </w:tblGrid>
+      <w:tr>
+        <w:trPr>
+          <w:tblHeader w:val="true"/>
+        </w:trPr>
+        <w:tc>
+          <w:tcPr>
+            <w:tcW w:type="dxa" w:w="2835"/>
+            <w:shd w:val="clear" w:color="auto" w:fill="3D4F1C"/>
+          </w:tcPr>
+          <w:p>
+            <w:pPr>
+              <w:spacing w:after="0"/>
+            </w:pPr>
+            <w:r/>
+            <w:r>
+              <w:rPr>
+                <w:b/>
+                <w:i w:val="0"/>
+                <w:color w:val="FFFFFF"/>
+                <w:sz w:val="20"/>
+              </w:rPr>
+              <w:t>Tâche</w:t>
+            </w:r>
+          </w:p>
+        </w:tc>
+        <w:tc>
+          <w:tcPr>
+            <w:tcW w:type="dxa" w:w="3628"/>
+            <w:shd w:val="clear" w:color="auto" w:fill="3D4F1C"/>
+          </w:tcPr>
+          <w:p>
+            <w:pPr>
+              <w:spacing w:after="0"/>
+            </w:pPr>
+            <w:r/>
+            <w:r>
+              <w:rPr>
+                <w:b/>
+                <w:i w:val="0"/>
+                <w:color w:val="FFFFFF"/>
+                <w:sz w:val="20"/>
+              </w:rPr>
+              <w:t>Apport de l’IA</w:t>
+            </w:r>
+          </w:p>
+        </w:tc>
+        <w:tc>
+          <w:tcPr>
+            <w:tcW w:type="dxa" w:w="2948"/>
+            <w:shd w:val="clear" w:color="auto" w:fill="3D4F1C"/>
+          </w:tcPr>
+          <w:p>
+            <w:pPr>
+              <w:spacing w:after="0"/>
+            </w:pPr>
+            <w:r/>
+            <w:r>
+              <w:rPr>
+                <w:b/>
+                <w:i w:val="0"/>
+                <w:color w:val="FFFFFF"/>
+                <w:sz w:val="20"/>
+              </w:rPr>
+              <w:t>Limite constatée</w:t>
+            </w:r>
+          </w:p>
+        </w:tc>
+      </w:tr>
+      <w:tr>
+        <w:tc>
+          <w:tcPr>
+            <w:tcW w:type="dxa" w:w="2835"/>
+          </w:tcPr>
+          <w:p>
+            <w:pPr>
+              <w:spacing w:after="0"/>
+            </w:pPr>
+            <w:r/>
+            <w:r>
+              <w:rPr>
+                <w:b w:val="0"/>
+                <w:i/>
+                <w:color w:val="8A8E7D"/>
+                <w:sz w:val="20"/>
+              </w:rPr>
+              <w:t>…</w:t>
+            </w:r>
+          </w:p>
+        </w:tc>
+        <w:tc>
+          <w:tcPr>
+            <w:tcW w:type="dxa" w:w="3628"/>
+          </w:tcPr>
+          <w:p>
+            <w:pPr>
+              <w:spacing w:after="0"/>
+            </w:pPr>
+            <w:r/>
+            <w:r>
+              <w:rPr>
+                <w:b w:val="0"/>
+                <w:i/>
+                <w:color w:val="8A8E7D"/>
+                <w:sz w:val="20"/>
+              </w:rPr>
+              <w:t>…</w:t>
+            </w:r>
+          </w:p>
+        </w:tc>
+        <w:tc>
+          <w:tcPr>
+            <w:tcW w:type="dxa" w:w="2948"/>
+          </w:tcPr>
+          <w:p>
+            <w:pPr>
+              <w:spacing w:after="0"/>
+            </w:pPr>
+            <w:r/>
+            <w:r>
+              <w:rPr>
+                <w:b w:val="0"/>
+                <w:i/>
+                <w:color w:val="8A8E7D"/>
+                <w:sz w:val="20"/>
+              </w:rPr>
+              <w:t>…</w:t>
+            </w:r>
+          </w:p>
+        </w:tc>
+      </w:tr>
+      <w:tr>
+        <w:tc>
+          <w:tcPr>
+            <w:tcW w:type="dxa" w:w="2835"/>
+          </w:tcPr>
+          <w:p>
+            <w:pPr>
+              <w:spacing w:after="0"/>
+            </w:pPr>
+            <w:r/>
+            <w:r>
+              <w:rPr>
+                <w:b w:val="0"/>
+                <w:i/>
+                <w:color w:val="8A8E7D"/>
+                <w:sz w:val="20"/>
+              </w:rPr>
+              <w:t>…</w:t>
+            </w:r>
+          </w:p>
+        </w:tc>
+        <w:tc>
+          <w:tcPr>
+            <w:tcW w:type="dxa" w:w="3628"/>
+          </w:tcPr>
+          <w:p>
+            <w:pPr>
+              <w:spacing w:after="0"/>
+            </w:pPr>
+            <w:r/>
+            <w:r>
+              <w:rPr>
+                <w:b w:val="0"/>
+                <w:i/>
+                <w:color w:val="8A8E7D"/>
+                <w:sz w:val="20"/>
+              </w:rPr>
+              <w:t>…</w:t>
+            </w:r>
+          </w:p>
+        </w:tc>
+        <w:tc>
+          <w:tcPr>
+            <w:tcW w:type="dxa" w:w="2948"/>
+          </w:tcPr>
+          <w:p>
+            <w:pPr>
+              <w:spacing w:after="0"/>
+            </w:pPr>
+            <w:r/>
+            <w:r>
+              <w:rPr>
+                <w:b w:val="0"/>
+                <w:i/>
+                <w:color w:val="8A8E7D"/>
+                <w:sz w:val="20"/>
+              </w:rPr>
+              <w:t>…</w:t>
+            </w:r>
+          </w:p>
+        </w:tc>
+      </w:tr>
+      <w:tr>
+        <w:tc>
+          <w:tcPr>
+            <w:tcW w:type="dxa" w:w="2835"/>
+          </w:tcPr>
+          <w:p>
+            <w:pPr>
+              <w:spacing w:after="0"/>
+            </w:pPr>
+            <w:r/>
+            <w:r>
+              <w:rPr>
+                <w:b w:val="0"/>
+                <w:i/>
+                <w:color w:val="8A8E7D"/>
+                <w:sz w:val="20"/>
+              </w:rPr>
+              <w:t>…</w:t>
+            </w:r>
+          </w:p>
+        </w:tc>
+        <w:tc>
+          <w:tcPr>
+            <w:tcW w:type="dxa" w:w="3628"/>
+          </w:tcPr>
+          <w:p>
+            <w:pPr>
+              <w:spacing w:after="0"/>
+            </w:pPr>
+            <w:r/>
+            <w:r>
+              <w:rPr>
+                <w:b w:val="0"/>
+                <w:i/>
+                <w:color w:val="8A8E7D"/>
+                <w:sz w:val="20"/>
+              </w:rPr>
+              <w:t>…</w:t>
+            </w:r>
+          </w:p>
+        </w:tc>
+        <w:tc>
+          <w:tcPr>
+            <w:tcW w:type="dxa" w:w="2948"/>
+          </w:tcPr>
+          <w:p>
+            <w:pPr>
+              <w:spacing w:after="0"/>
+            </w:pPr>
+            <w:r/>
+            <w:r>
+              <w:rPr>
+                <w:b w:val="0"/>
+                <w:i/>
+                <w:color w:val="8A8E7D"/>
+                <w:sz w:val="20"/>
+              </w:rPr>
+              <w:t>…</w:t>
+            </w:r>
+          </w:p>
+        </w:tc>
+      </w:tr>
+    </w:tbl>
+    <w:p>
+      <w:pPr>
+        <w:spacing w:after="40"/>
+      </w:pPr>
+    </w:p>
+    <w:p>
+      <w:pPr>
+        <w:pStyle w:val="Heading1"/>
+      </w:pPr>
+      <w:r>
+        <w:t>7. Limites et bonnes pratiques retenues</w:t>
       </w:r>
     </w:p>
     <w:p>
+      <w:pPr>
+        <w:spacing w:after="120"/>
+      </w:pPr>
       <w:r>
-        <w:t>À compléter : tâches accélérées par l’IA, erreurs de l’IA que j’ai corrigées, limites rencontrées.</w:t>
+        <w:rPr>
+          <w:i/>
+          <w:color w:val="8A8E7D"/>
+        </w:rPr>
+        <w:t>À compléter — les erreurs de l’IA que vous avez corrigées et les bonnes pratiques que vous retenez.</w:t>
+      </w:r>
+    </w:p>
+    <w:p>
+      <w:pPr>
+        <w:pStyle w:val="Heading1"/>
+      </w:pPr>
+      <w:r>
+        <w:t>8. Conclusion</w:t>
+      </w:r>
+    </w:p>
+    <w:p>
+      <w:pPr>
+        <w:spacing w:after="120"/>
+      </w:pPr>
+      <w:r>
+        <w:rPr>
+          <w:i/>
+          <w:color w:val="8A8E7D"/>
+        </w:rPr>
+        <w:t>À compléter — deux ou trois phrases sur ce que l’IA générative vous a apporté dans ce projet.</w:t>
       </w:r>
     </w:p>
     <w:sectPr>
-      <w:pgSz w:w="12240" w:h="15840"/>
-      <w:pgMar w:top="1440" w:right="1800" w:bottom="1440" w:left="1800" w:header="720" w:footer="720" w:gutter="0"/>
+      <w:headerReference w:type="default" r:id="rId9"/>
+      <w:footerReference w:type="default" r:id="rId10"/>
+      <w:pgSz w:w="11906" w:h="16838"/>
+      <w:pgMar w:top="1247" w:right="1247" w:bottom="1134" w:left="1247" w:header="720" w:footer="720" w:gutter="0"/>
       <w:cols w:space="720"/>
+      <w:titlePg/>
       <w:docGrid w:linePitch="360"/>
     </w:sectPr>
   </w:body>
 </w:document>
+</file>
+
+<file path=word/footer1.xml><?xml version="1.0" encoding="utf-8"?>
+<w:ftr xmlns:m="http://schemas.openxmlformats.org/officeDocument/2006/math" xmlns:mc="http://schemas.openxmlformats.org/markup-compatibility/2006" xmlns:mo="http://schemas.microsoft.com/office/mac/office/2008/main" xmlns:mv="urn:schemas-microsoft-com:mac:vml" xmlns:o="urn:schemas-microsoft-com:office:office" xmlns:r="http://schemas.openxmlformats.org/officeDocument/2006/relationships" xmlns:v="urn:schemas-microsoft-com:vml" xmlns:w10="urn:schemas-microsoft-com:office:word" xmlns:w14="http://schemas.microsoft.com/office/word/2010/wordml" xmlns:w="http://schemas.openxmlformats.org/wordprocessingml/2006/main" xmlns:wne="http://schemas.microsoft.com/office/word/2006/wordml" xmlns:wp14="http://schemas.microsoft.com/office/word/2010/wordprocessingDrawing" xmlns:wp="http://schemas.openxmlformats.org/drawingml/2006/wordprocessingDrawing" xmlns:wpc="http://schemas.microsoft.com/office/word/2010/wordprocessingCanvas" xmlns:wpg="http://schemas.microsoft.com/office/word/2010/wordprocessingGroup" xmlns:wpi="http://schemas.microsoft.com/office/word/2010/wordprocessingInk" xmlns:wps="http://schemas.microsoft.com/office/word/2010/wordprocessingShape" mc:Ignorable="w14 wp14">
+  <w:p>
+    <w:pPr>
+      <w:pStyle w:val="Footer"/>
+      <w:jc w:val="center"/>
+    </w:pPr>
+    <w:r/>
+    <w:r>
+      <w:rPr>
+        <w:color w:val="8A8E7D"/>
+        <w:sz w:val="17"/>
+      </w:rPr>
+      <w:t xml:space="preserve">IA for Software Engineering · ESPRIT · 5SAE10 · page </w:t>
+    </w:r>
+    <w:r>
+      <w:fldChar w:fldCharType="begin"/>
+      <w:instrText xml:space="preserve">PAGE</w:instrText>
+      <w:fldChar w:fldCharType="end"/>
+    </w:r>
+  </w:p>
+</w:ftr>
+</file>
+
+<file path=word/header1.xml><?xml version="1.0" encoding="utf-8"?>
+<w:hdr xmlns:m="http://schemas.openxmlformats.org/officeDocument/2006/math" xmlns:mc="http://schemas.openxmlformats.org/markup-compatibility/2006" xmlns:mo="http://schemas.microsoft.com/office/mac/office/2008/main" xmlns:mv="urn:schemas-microsoft-com:mac:vml" xmlns:o="urn:schemas-microsoft-com:office:office" xmlns:r="http://schemas.openxmlformats.org/officeDocument/2006/relationships" xmlns:v="urn:schemas-microsoft-com:vml" xmlns:w10="urn:schemas-microsoft-com:office:word" xmlns:w14="http://schemas.microsoft.com/office/word/2010/wordml" xmlns:w="http://schemas.openxmlformats.org/wordprocessingml/2006/main" xmlns:wne="http://schemas.microsoft.com/office/word/2006/wordml" xmlns:wp14="http://schemas.microsoft.com/office/word/2010/wordprocessingDrawing" xmlns:wp="http://schemas.openxmlformats.org/drawingml/2006/wordprocessingDrawing" xmlns:wpc="http://schemas.microsoft.com/office/word/2010/wordprocessingCanvas" xmlns:wpg="http://schemas.microsoft.com/office/word/2010/wordprocessingGroup" xmlns:wpi="http://schemas.microsoft.com/office/word/2010/wordprocessingInk" xmlns:wps="http://schemas.microsoft.com/office/word/2010/wordprocessingShape" mc:Ignorable="w14 wp14">
+  <w:p>
+    <w:pPr>
+      <w:pStyle w:val="Header"/>
+    </w:pPr>
+    <w:r/>
+    <w:r>
+      <w:rPr>
+        <w:color w:val="8A8E7D"/>
+        <w:sz w:val="17"/>
+      </w:rPr>
+      <w:t>Zitouna AI · Documentation individuelle · Aziz Dlissi</w:t>
+    </w:r>
+  </w:p>
+</w:hdr>
 </file>
 
 <file path=word/numbering.xml><?xml version="1.0" encoding="utf-8"?>
@@ -785,7 +2311,8 @@
     <w:qFormat/>
     <w:rsid w:val="00FC693F"/>
     <w:rPr>
-      <w:rFonts w:ascii="Calibri" w:hAnsi="Calibri"/>
+      <w:rFonts w:ascii="Calibri" w:hAnsi="Calibri" w:eastAsia="Calibri"/>
+      <w:color w:val="1D2214"/>
       <w:sz w:val="22"/>
     </w:rPr>
   </w:style>
@@ -844,15 +2371,15 @@
     <w:pPr>
       <w:keepNext/>
       <w:keepLines/>
-      <w:spacing w:before="480" w:after="0"/>
+      <w:spacing w:before="280" w:after="120"/>
       <w:outlineLvl w:val="0"/>
     </w:pPr>
     <w:rPr>
-      <w:rFonts w:asciiTheme="majorHAnsi" w:eastAsiaTheme="majorEastAsia" w:hAnsiTheme="majorHAnsi" w:cstheme="majorBidi"/>
+      <w:rFonts w:asciiTheme="majorHAnsi" w:eastAsiaTheme="majorEastAsia" w:hAnsiTheme="majorHAnsi" w:cstheme="majorBidi" w:ascii="Cambria" w:hAnsi="Cambria" w:eastAsia="Cambria"/>
       <w:b/>
       <w:bCs/>
-      <w:color w:val="365F91" w:themeColor="accent1" w:themeShade="BF"/>
-      <w:sz w:val="28"/>
+      <w:color w:val="3D4F1C"/>
+      <w:sz w:val="30"/>
       <w:szCs w:val="28"/>
     </w:rPr>
   </w:style>

</xml_diff>

<commit_message>
Documentation individuelle : fiches M1, M3, M4, M5 et M6 complétées
Pour chaque module : outils, méthode, interactions réelles avec
Claude Code pendant l'intégration (problèmes rencontrés et
corrections), justification du modèle, gains de productivité,
limites, bonnes pratiques et conclusion. Une section « Mes propres
prompts » reste à compléter par chaque membre.

Co-Authored-By: Claude Opus 5.5 <noreply@anthropic.com>
</commit_message>
<xml_diff>
--- a/docs/documentation-individuelle/Documentation-individuelle-Aziz-Dlissi.docx
+++ b/docs/documentation-individuelle/Documentation-individuelle-Aziz-Dlissi.docx
@@ -325,18 +325,6 @@
         <w:t>2. Outils d’IA générative utilisés</w:t>
       </w:r>
     </w:p>
-    <w:p>
-      <w:pPr>
-        <w:spacing w:after="120"/>
-      </w:pPr>
-      <w:r>
-        <w:rPr>
-          <w:i/>
-          <w:color w:val="8A8E7D"/>
-        </w:rPr>
-        <w:t>À compléter — indiquer les outils utilisés (Claude, Copilot, ChatGPT…) et pour quelles tâches.</w:t>
-      </w:r>
-    </w:p>
     <w:tbl>
       <w:tblPr>
         <w:tblStyle w:val="TableGrid"/>
@@ -431,11 +419,10 @@
             <w:r>
               <w:rPr>
                 <w:b w:val="0"/>
-                <w:i/>
-                <w:color w:val="8A8E7D"/>
+                <w:i w:val="0"/>
                 <w:sz w:val="20"/>
               </w:rPr>
-              <w:t>…</w:t>
+              <w:t>Claude Code (Anthropic)</w:t>
             </w:r>
           </w:p>
         </w:tc>
@@ -451,11 +438,10 @@
             <w:r>
               <w:rPr>
                 <w:b w:val="0"/>
-                <w:i/>
-                <w:color w:val="8A8E7D"/>
+                <w:i w:val="0"/>
                 <w:sz w:val="20"/>
               </w:rPr>
-              <w:t>…</w:t>
+              <w:t>Assistant de développement connecté au dépôt</w:t>
             </w:r>
           </w:p>
         </w:tc>
@@ -471,11 +457,10 @@
             <w:r>
               <w:rPr>
                 <w:b w:val="0"/>
-                <w:i/>
-                <w:color w:val="8A8E7D"/>
+                <w:i w:val="0"/>
                 <w:sz w:val="20"/>
               </w:rPr>
-              <w:t>…</w:t>
+              <w:t>Intégration du module : code, entraînement, tests, documentation</w:t>
             </w:r>
           </w:p>
         </w:tc>
@@ -484,6 +469,7 @@
         <w:tc>
           <w:tcPr>
             <w:tcW w:type="dxa" w:w="2381"/>
+            <w:shd w:val="clear" w:color="auto" w:fill="F1F3E8"/>
           </w:tcPr>
           <w:p>
             <w:pPr>
@@ -493,17 +479,17 @@
             <w:r>
               <w:rPr>
                 <w:b w:val="0"/>
-                <w:i/>
-                <w:color w:val="8A8E7D"/>
+                <w:i w:val="0"/>
                 <w:sz w:val="20"/>
               </w:rPr>
-              <w:t>…</w:t>
+              <w:t>À compléter</w:t>
             </w:r>
           </w:p>
         </w:tc>
         <w:tc>
           <w:tcPr>
             <w:tcW w:type="dxa" w:w="2835"/>
+            <w:shd w:val="clear" w:color="auto" w:fill="F1F3E8"/>
           </w:tcPr>
           <w:p>
             <w:pPr>
@@ -513,17 +499,17 @@
             <w:r>
               <w:rPr>
                 <w:b w:val="0"/>
-                <w:i/>
-                <w:color w:val="8A8E7D"/>
+                <w:i w:val="0"/>
                 <w:sz w:val="20"/>
               </w:rPr>
-              <w:t>…</w:t>
+              <w:t>Outils utilisés personnellement (Copilot, ChatGPT…)</w:t>
             </w:r>
           </w:p>
         </w:tc>
         <w:tc>
           <w:tcPr>
             <w:tcW w:type="dxa" w:w="4195"/>
+            <w:shd w:val="clear" w:color="auto" w:fill="F1F3E8"/>
           </w:tcPr>
           <w:p>
             <w:pPr>
@@ -533,70 +519,7 @@
             <w:r>
               <w:rPr>
                 <w:b w:val="0"/>
-                <w:i/>
-                <w:color w:val="8A8E7D"/>
-                <w:sz w:val="20"/>
-              </w:rPr>
-              <w:t>…</w:t>
-            </w:r>
-          </w:p>
-        </w:tc>
-      </w:tr>
-      <w:tr>
-        <w:tc>
-          <w:tcPr>
-            <w:tcW w:type="dxa" w:w="2381"/>
-          </w:tcPr>
-          <w:p>
-            <w:pPr>
-              <w:spacing w:after="0"/>
-            </w:pPr>
-            <w:r/>
-            <w:r>
-              <w:rPr>
-                <w:b w:val="0"/>
-                <w:i/>
-                <w:color w:val="8A8E7D"/>
-                <w:sz w:val="20"/>
-              </w:rPr>
-              <w:t>…</w:t>
-            </w:r>
-          </w:p>
-        </w:tc>
-        <w:tc>
-          <w:tcPr>
-            <w:tcW w:type="dxa" w:w="2835"/>
-          </w:tcPr>
-          <w:p>
-            <w:pPr>
-              <w:spacing w:after="0"/>
-            </w:pPr>
-            <w:r/>
-            <w:r>
-              <w:rPr>
-                <w:b w:val="0"/>
-                <w:i/>
-                <w:color w:val="8A8E7D"/>
-                <w:sz w:val="20"/>
-              </w:rPr>
-              <w:t>…</w:t>
-            </w:r>
-          </w:p>
-        </w:tc>
-        <w:tc>
-          <w:tcPr>
-            <w:tcW w:type="dxa" w:w="4195"/>
-          </w:tcPr>
-          <w:p>
-            <w:pPr>
-              <w:spacing w:after="0"/>
-            </w:pPr>
-            <w:r/>
-            <w:r>
-              <w:rPr>
-                <w:b w:val="0"/>
-                <w:i/>
-                <w:color w:val="8A8E7D"/>
+                <w:i w:val="0"/>
                 <w:sz w:val="20"/>
               </w:rPr>
               <w:t>…</w:t>
@@ -624,10 +547,9 @@
       </w:pPr>
       <w:r>
         <w:rPr>
-          <w:i/>
-          <w:color w:val="8A8E7D"/>
+          <w:i w:val="0"/>
         </w:rPr>
-        <w:t>À compléter — décrire comment vous avez formulé vos demandes à l’IA et comment vous avez vérifié ses réponses.</w:t>
+        <w:t>Le module a été intégré avec une boucle courte : une demande précise avec ses contraintes, une proposition de l’IA, une exécution réelle (entraînement, test, appel du service), puis une correction si le résultat ne convient pas. Aucun chiffre n’est gardé sans avoir été mesuré sur les données de test.</w:t>
       </w:r>
     </w:p>
     <w:p>
@@ -644,10 +566,563 @@
       </w:pPr>
       <w:r>
         <w:rPr>
+          <w:b/>
+          <w:i w:val="0"/>
+        </w:rPr>
+        <w:t>4.1 Interactions avec Claude Code pendant l’intégration du module (session de l’équipe)</w:t>
+      </w:r>
+    </w:p>
+    <w:tbl>
+      <w:tblPr>
+        <w:tblStyle w:val="TableGrid"/>
+        <w:tblW w:type="auto" w:w="0"/>
+        <w:jc w:val="center"/>
+        <w:tblLayout w:type="fixed"/>
+        <w:tblLook w:firstColumn="1" w:firstRow="1" w:lastColumn="0" w:lastRow="0" w:noHBand="0" w:noVBand="1" w:val="04A0"/>
+      </w:tblPr>
+      <w:tblGrid>
+        <w:gridCol w:w="1882"/>
+        <w:gridCol w:w="1882"/>
+        <w:gridCol w:w="1882"/>
+        <w:gridCol w:w="1882"/>
+        <w:gridCol w:w="1882"/>
+      </w:tblGrid>
+      <w:tr>
+        <w:trPr>
+          <w:tblHeader w:val="true"/>
+        </w:trPr>
+        <w:tc>
+          <w:tcPr>
+            <w:tcW w:type="dxa" w:w="1361"/>
+            <w:shd w:val="clear" w:color="auto" w:fill="3D4F1C"/>
+          </w:tcPr>
+          <w:p>
+            <w:pPr>
+              <w:spacing w:after="0"/>
+            </w:pPr>
+            <w:r/>
+            <w:r>
+              <w:rPr>
+                <w:b/>
+                <w:i w:val="0"/>
+                <w:color w:val="FFFFFF"/>
+                <w:sz w:val="20"/>
+              </w:rPr>
+              <w:t>Date</w:t>
+            </w:r>
+          </w:p>
+        </w:tc>
+        <w:tc>
+          <w:tcPr>
+            <w:tcW w:type="dxa" w:w="1191"/>
+            <w:shd w:val="clear" w:color="auto" w:fill="3D4F1C"/>
+          </w:tcPr>
+          <w:p>
+            <w:pPr>
+              <w:spacing w:after="0"/>
+            </w:pPr>
+            <w:r/>
+            <w:r>
+              <w:rPr>
+                <w:b/>
+                <w:i w:val="0"/>
+                <w:color w:val="FFFFFF"/>
+                <w:sz w:val="20"/>
+              </w:rPr>
+              <w:t>Objectif</w:t>
+            </w:r>
+          </w:p>
+        </w:tc>
+        <w:tc>
+          <w:tcPr>
+            <w:tcW w:type="dxa" w:w="2381"/>
+            <w:shd w:val="clear" w:color="auto" w:fill="3D4F1C"/>
+          </w:tcPr>
+          <w:p>
+            <w:pPr>
+              <w:spacing w:after="0"/>
+            </w:pPr>
+            <w:r/>
+            <w:r>
+              <w:rPr>
+                <w:b/>
+                <w:i w:val="0"/>
+                <w:color w:val="FFFFFF"/>
+                <w:sz w:val="20"/>
+              </w:rPr>
+              <w:t>Prompt ou situation</w:t>
+            </w:r>
+          </w:p>
+        </w:tc>
+        <w:tc>
+          <w:tcPr>
+            <w:tcW w:type="dxa" w:w="2438"/>
+            <w:shd w:val="clear" w:color="auto" w:fill="3D4F1C"/>
+          </w:tcPr>
+          <w:p>
+            <w:pPr>
+              <w:spacing w:after="0"/>
+            </w:pPr>
+            <w:r/>
+            <w:r>
+              <w:rPr>
+                <w:b/>
+                <w:i w:val="0"/>
+                <w:color w:val="FFFFFF"/>
+                <w:sz w:val="20"/>
+              </w:rPr>
+              <w:t>Réponse / action de l’IA</w:t>
+            </w:r>
+          </w:p>
+        </w:tc>
+        <w:tc>
+          <w:tcPr>
+            <w:tcW w:type="dxa" w:w="2041"/>
+            <w:shd w:val="clear" w:color="auto" w:fill="3D4F1C"/>
+          </w:tcPr>
+          <w:p>
+            <w:pPr>
+              <w:spacing w:after="0"/>
+            </w:pPr>
+            <w:r/>
+            <w:r>
+              <w:rPr>
+                <w:b/>
+                <w:i w:val="0"/>
+                <w:color w:val="FFFFFF"/>
+                <w:sz w:val="20"/>
+              </w:rPr>
+              <w:t>Vérification</w:t>
+            </w:r>
+          </w:p>
+        </w:tc>
+      </w:tr>
+      <w:tr>
+        <w:tc>
+          <w:tcPr>
+            <w:tcW w:type="dxa" w:w="1361"/>
+          </w:tcPr>
+          <w:p>
+            <w:pPr>
+              <w:spacing w:after="0"/>
+            </w:pPr>
+            <w:r/>
+            <w:r>
+              <w:rPr>
+                <w:b w:val="0"/>
+                <w:i w:val="0"/>
+                <w:sz w:val="20"/>
+              </w:rPr>
+              <w:t>10/2026</w:t>
+            </w:r>
+          </w:p>
+        </w:tc>
+        <w:tc>
+          <w:tcPr>
+            <w:tcW w:type="dxa" w:w="1191"/>
+          </w:tcPr>
+          <w:p>
+            <w:pPr>
+              <w:spacing w:after="0"/>
+            </w:pPr>
+            <w:r/>
+            <w:r>
+              <w:rPr>
+                <w:b w:val="0"/>
+                <w:i w:val="0"/>
+                <w:sz w:val="20"/>
+              </w:rPr>
+              <w:t>Choix du modèle</w:t>
+            </w:r>
+          </w:p>
+        </w:tc>
+        <w:tc>
+          <w:tcPr>
+            <w:tcW w:type="dxa" w:w="2381"/>
+          </w:tcPr>
+          <w:p>
+            <w:pPr>
+              <w:spacing w:after="0"/>
+            </w:pPr>
+            <w:r/>
+            <w:r>
+              <w:rPr>
+                <w:b w:val="0"/>
+                <w:i w:val="0"/>
+                <w:sz w:val="20"/>
+              </w:rPr>
+              <w:t>« OpenCV réel » (plutôt qu’un comptage simulé)</w:t>
+            </w:r>
+          </w:p>
+        </w:tc>
+        <w:tc>
+          <w:tcPr>
+            <w:tcW w:type="dxa" w:w="2438"/>
+          </w:tcPr>
+          <w:p>
+            <w:pPr>
+              <w:spacing w:after="0"/>
+            </w:pPr>
+            <w:r/>
+            <w:r>
+              <w:rPr>
+                <w:b w:val="0"/>
+                <w:i w:val="0"/>
+                <w:sz w:val="20"/>
+              </w:rPr>
+              <w:t>Détecteur OpenCV : indice de végétation, seuil d’Otsu, transformée de distance</w:t>
+            </w:r>
+          </w:p>
+        </w:tc>
+        <w:tc>
+          <w:tcPr>
+            <w:tcW w:type="dxa" w:w="2041"/>
+          </w:tcPr>
+          <w:p>
+            <w:pPr>
+              <w:spacing w:after="0"/>
+            </w:pPr>
+            <w:r/>
+            <w:r>
+              <w:rPr>
+                <w:b w:val="0"/>
+                <w:i w:val="0"/>
+                <w:sz w:val="20"/>
+              </w:rPr>
+              <w:t>Vergers de test : 296 arbres trouvés sur 296</w:t>
+            </w:r>
+          </w:p>
+        </w:tc>
+      </w:tr>
+      <w:tr>
+        <w:tc>
+          <w:tcPr>
+            <w:tcW w:type="dxa" w:w="1361"/>
+            <w:shd w:val="clear" w:color="auto" w:fill="F1F3E8"/>
+          </w:tcPr>
+          <w:p>
+            <w:pPr>
+              <w:spacing w:after="0"/>
+            </w:pPr>
+            <w:r/>
+            <w:r>
+              <w:rPr>
+                <w:b w:val="0"/>
+                <w:i w:val="0"/>
+                <w:sz w:val="20"/>
+              </w:rPr>
+              <w:t>10/2026</w:t>
+            </w:r>
+          </w:p>
+        </w:tc>
+        <w:tc>
+          <w:tcPr>
+            <w:tcW w:type="dxa" w:w="1191"/>
+            <w:shd w:val="clear" w:color="auto" w:fill="F1F3E8"/>
+          </w:tcPr>
+          <w:p>
+            <w:pPr>
+              <w:spacing w:after="0"/>
+            </w:pPr>
+            <w:r/>
+            <w:r>
+              <w:rPr>
+                <w:b w:val="0"/>
+                <w:i w:val="0"/>
+                <w:sz w:val="20"/>
+              </w:rPr>
+              <w:t>Comprendre</w:t>
+            </w:r>
+          </w:p>
+        </w:tc>
+        <w:tc>
+          <w:tcPr>
+            <w:tcW w:type="dxa" w:w="2381"/>
+            <w:shd w:val="clear" w:color="auto" w:fill="F1F3E8"/>
+          </w:tcPr>
+          <w:p>
+            <w:pPr>
+              <w:spacing w:after="0"/>
+            </w:pPr>
+            <w:r/>
+            <w:r>
+              <w:rPr>
+                <w:b w:val="0"/>
+                <w:i w:val="0"/>
+                <w:sz w:val="20"/>
+              </w:rPr>
+              <w:t>« j’ai pas compris » (comment tester le comptage)</w:t>
+            </w:r>
+          </w:p>
+        </w:tc>
+        <w:tc>
+          <w:tcPr>
+            <w:tcW w:type="dxa" w:w="2438"/>
+            <w:shd w:val="clear" w:color="auto" w:fill="F1F3E8"/>
+          </w:tcPr>
+          <w:p>
+            <w:pPr>
+              <w:spacing w:after="0"/>
+            </w:pPr>
+            <w:r/>
+            <w:r>
+              <w:rPr>
+                <w:b w:val="0"/>
+                <w:i w:val="0"/>
+                <w:sz w:val="20"/>
+              </w:rPr>
+              <w:t>Explication pas à pas : image vue du ciel envoyée depuis la page de la parcelle</w:t>
+            </w:r>
+          </w:p>
+        </w:tc>
+        <w:tc>
+          <w:tcPr>
+            <w:tcW w:type="dxa" w:w="2041"/>
+            <w:shd w:val="clear" w:color="auto" w:fill="F1F3E8"/>
+          </w:tcPr>
+          <w:p>
+            <w:pPr>
+              <w:spacing w:after="0"/>
+            </w:pPr>
+            <w:r/>
+            <w:r>
+              <w:rPr>
+                <w:b w:val="0"/>
+                <w:i w:val="0"/>
+                <w:sz w:val="20"/>
+              </w:rPr>
+              <w:t>Image annotée avec un cadre par arbre</w:t>
+            </w:r>
+          </w:p>
+        </w:tc>
+      </w:tr>
+      <w:tr>
+        <w:tc>
+          <w:tcPr>
+            <w:tcW w:type="dxa" w:w="1361"/>
+          </w:tcPr>
+          <w:p>
+            <w:pPr>
+              <w:spacing w:after="0"/>
+            </w:pPr>
+            <w:r/>
+            <w:r>
+              <w:rPr>
+                <w:b w:val="0"/>
+                <w:i w:val="0"/>
+                <w:sz w:val="20"/>
+              </w:rPr>
+              <w:t>10/2026</w:t>
+            </w:r>
+          </w:p>
+        </w:tc>
+        <w:tc>
+          <w:tcPr>
+            <w:tcW w:type="dxa" w:w="1191"/>
+          </w:tcPr>
+          <w:p>
+            <w:pPr>
+              <w:spacing w:after="0"/>
+            </w:pPr>
+            <w:r/>
+            <w:r>
+              <w:rPr>
+                <w:b w:val="0"/>
+                <w:i w:val="0"/>
+                <w:sz w:val="20"/>
+              </w:rPr>
+              <w:t>Tests</w:t>
+            </w:r>
+          </w:p>
+        </w:tc>
+        <w:tc>
+          <w:tcPr>
+            <w:tcW w:type="dxa" w:w="2381"/>
+          </w:tcPr>
+          <w:p>
+            <w:pPr>
+              <w:spacing w:after="0"/>
+            </w:pPr>
+            <w:r/>
+            <w:r>
+              <w:rPr>
+                <w:b w:val="0"/>
+                <w:i w:val="0"/>
+                <w:sz w:val="20"/>
+              </w:rPr>
+              <w:t>Évaluer sans images annotées</w:t>
+            </w:r>
+          </w:p>
+        </w:tc>
+        <w:tc>
+          <w:tcPr>
+            <w:tcW w:type="dxa" w:w="2438"/>
+          </w:tcPr>
+          <w:p>
+            <w:pPr>
+              <w:spacing w:after="0"/>
+            </w:pPr>
+            <w:r/>
+            <w:r>
+              <w:rPr>
+                <w:b w:val="0"/>
+                <w:i w:val="0"/>
+                <w:sz w:val="20"/>
+              </w:rPr>
+              <w:t>Générateur de vergers synthétiques à nombre d’arbres connu, couronnes collées comprises</w:t>
+            </w:r>
+          </w:p>
+        </w:tc>
+        <w:tc>
+          <w:tcPr>
+            <w:tcW w:type="dxa" w:w="2041"/>
+          </w:tcPr>
+          <w:p>
+            <w:pPr>
+              <w:spacing w:after="0"/>
+            </w:pPr>
+            <w:r/>
+            <w:r>
+              <w:rPr>
+                <w:b w:val="0"/>
+                <w:i w:val="0"/>
+                <w:sz w:val="20"/>
+              </w:rPr>
+              <w:t>9 tests : erreur ≤ 5 %, sol nu = 0 arbre</w:t>
+            </w:r>
+          </w:p>
+        </w:tc>
+      </w:tr>
+      <w:tr>
+        <w:tc>
+          <w:tcPr>
+            <w:tcW w:type="dxa" w:w="1361"/>
+            <w:shd w:val="clear" w:color="auto" w:fill="F1F3E8"/>
+          </w:tcPr>
+          <w:p>
+            <w:pPr>
+              <w:spacing w:after="0"/>
+            </w:pPr>
+            <w:r/>
+            <w:r>
+              <w:rPr>
+                <w:b w:val="0"/>
+                <w:i w:val="0"/>
+                <w:sz w:val="20"/>
+              </w:rPr>
+              <w:t>10/2026</w:t>
+            </w:r>
+          </w:p>
+        </w:tc>
+        <w:tc>
+          <w:tcPr>
+            <w:tcW w:type="dxa" w:w="1191"/>
+            <w:shd w:val="clear" w:color="auto" w:fill="F1F3E8"/>
+          </w:tcPr>
+          <w:p>
+            <w:pPr>
+              <w:spacing w:after="0"/>
+            </w:pPr>
+            <w:r/>
+            <w:r>
+              <w:rPr>
+                <w:b w:val="0"/>
+                <w:i w:val="0"/>
+                <w:sz w:val="20"/>
+              </w:rPr>
+              <w:t>Déploiement</w:t>
+            </w:r>
+          </w:p>
+        </w:tc>
+        <w:tc>
+          <w:tcPr>
+            <w:tcW w:type="dxa" w:w="2381"/>
+            <w:shd w:val="clear" w:color="auto" w:fill="F1F3E8"/>
+          </w:tcPr>
+          <w:p>
+            <w:pPr>
+              <w:spacing w:after="0"/>
+            </w:pPr>
+            <w:r/>
+            <w:r>
+              <w:rPr>
+                <w:b w:val="0"/>
+                <w:i w:val="0"/>
+                <w:sz w:val="20"/>
+              </w:rPr>
+              <w:t>Échec de la construction parallèle des images Docker</w:t>
+            </w:r>
+          </w:p>
+        </w:tc>
+        <w:tc>
+          <w:tcPr>
+            <w:tcW w:type="dxa" w:w="2438"/>
+            <w:shd w:val="clear" w:color="auto" w:fill="F1F3E8"/>
+          </w:tcPr>
+          <w:p>
+            <w:pPr>
+              <w:spacing w:after="0"/>
+            </w:pPr>
+            <w:r/>
+            <w:r>
+              <w:rPr>
+                <w:b w:val="0"/>
+                <w:i w:val="0"/>
+                <w:sz w:val="20"/>
+              </w:rPr>
+              <w:t>Construction service par service sur réseau lent</w:t>
+            </w:r>
+          </w:p>
+        </w:tc>
+        <w:tc>
+          <w:tcPr>
+            <w:tcW w:type="dxa" w:w="2041"/>
+            <w:shd w:val="clear" w:color="auto" w:fill="F1F3E8"/>
+          </w:tcPr>
+          <w:p>
+            <w:pPr>
+              <w:spacing w:after="0"/>
+            </w:pPr>
+            <w:r/>
+            <w:r>
+              <w:rPr>
+                <w:b w:val="0"/>
+                <w:i w:val="0"/>
+                <w:sz w:val="20"/>
+              </w:rPr>
+              <w:t>9 conteneurs démarrés et en bonne santé</w:t>
+            </w:r>
+          </w:p>
+        </w:tc>
+      </w:tr>
+    </w:tbl>
+    <w:p>
+      <w:pPr>
+        <w:spacing w:after="40"/>
+      </w:pPr>
+    </w:p>
+    <w:p>
+      <w:pPr>
+        <w:spacing w:after="120"/>
+      </w:pPr>
+      <w:r>
+        <w:rPr>
+          <w:b/>
+          <w:i w:val="0"/>
+        </w:rPr>
+        <w:t>4.2 Mes propres prompts</w:t>
+      </w:r>
+    </w:p>
+    <w:p>
+      <w:pPr>
+        <w:spacing w:after="120"/>
+      </w:pPr>
+      <w:r>
+        <w:rPr>
           <w:i/>
           <w:color w:val="8A8E7D"/>
         </w:rPr>
-        <w:t>À compléter — pour chaque échange important : la date, l’objectif, le prompt exact, ce que l’IA a répondu ou fait, et comment vous l’avez vérifié ou corrigé.</w:t>
+        <w:t>À compléter — ajouter vos échanges personnels avec un LLM (Claude, Copilot, ChatGPT…) : le prompt exact, la réponse et ce que vous avez gardé ou corrigé.</w:t>
       </w:r>
     </w:p>
     <w:tbl>
@@ -771,312 +1246,6 @@
                 <w:sz w:val="20"/>
               </w:rPr>
               <w:t>Vérification</w:t>
-            </w:r>
-          </w:p>
-        </w:tc>
-      </w:tr>
-      <w:tr>
-        <w:tc>
-          <w:tcPr>
-            <w:tcW w:type="dxa" w:w="1361"/>
-          </w:tcPr>
-          <w:p>
-            <w:pPr>
-              <w:spacing w:after="0"/>
-            </w:pPr>
-            <w:r/>
-            <w:r>
-              <w:rPr>
-                <w:b w:val="0"/>
-                <w:i/>
-                <w:color w:val="8A8E7D"/>
-                <w:sz w:val="20"/>
-              </w:rPr>
-              <w:t>…</w:t>
-            </w:r>
-          </w:p>
-        </w:tc>
-        <w:tc>
-          <w:tcPr>
-            <w:tcW w:type="dxa" w:w="1191"/>
-          </w:tcPr>
-          <w:p>
-            <w:pPr>
-              <w:spacing w:after="0"/>
-            </w:pPr>
-            <w:r/>
-            <w:r>
-              <w:rPr>
-                <w:b w:val="0"/>
-                <w:i/>
-                <w:color w:val="8A8E7D"/>
-                <w:sz w:val="20"/>
-              </w:rPr>
-              <w:t>…</w:t>
-            </w:r>
-          </w:p>
-        </w:tc>
-        <w:tc>
-          <w:tcPr>
-            <w:tcW w:type="dxa" w:w="2381"/>
-          </w:tcPr>
-          <w:p>
-            <w:pPr>
-              <w:spacing w:after="0"/>
-            </w:pPr>
-            <w:r/>
-            <w:r>
-              <w:rPr>
-                <w:b w:val="0"/>
-                <w:i/>
-                <w:color w:val="8A8E7D"/>
-                <w:sz w:val="20"/>
-              </w:rPr>
-              <w:t>…</w:t>
-            </w:r>
-          </w:p>
-        </w:tc>
-        <w:tc>
-          <w:tcPr>
-            <w:tcW w:type="dxa" w:w="2438"/>
-          </w:tcPr>
-          <w:p>
-            <w:pPr>
-              <w:spacing w:after="0"/>
-            </w:pPr>
-            <w:r/>
-            <w:r>
-              <w:rPr>
-                <w:b w:val="0"/>
-                <w:i/>
-                <w:color w:val="8A8E7D"/>
-                <w:sz w:val="20"/>
-              </w:rPr>
-              <w:t>…</w:t>
-            </w:r>
-          </w:p>
-        </w:tc>
-        <w:tc>
-          <w:tcPr>
-            <w:tcW w:type="dxa" w:w="2041"/>
-          </w:tcPr>
-          <w:p>
-            <w:pPr>
-              <w:spacing w:after="0"/>
-            </w:pPr>
-            <w:r/>
-            <w:r>
-              <w:rPr>
-                <w:b w:val="0"/>
-                <w:i/>
-                <w:color w:val="8A8E7D"/>
-                <w:sz w:val="20"/>
-              </w:rPr>
-              <w:t>…</w:t>
-            </w:r>
-          </w:p>
-        </w:tc>
-      </w:tr>
-      <w:tr>
-        <w:tc>
-          <w:tcPr>
-            <w:tcW w:type="dxa" w:w="1361"/>
-          </w:tcPr>
-          <w:p>
-            <w:pPr>
-              <w:spacing w:after="0"/>
-            </w:pPr>
-            <w:r/>
-            <w:r>
-              <w:rPr>
-                <w:b w:val="0"/>
-                <w:i/>
-                <w:color w:val="8A8E7D"/>
-                <w:sz w:val="20"/>
-              </w:rPr>
-              <w:t>…</w:t>
-            </w:r>
-          </w:p>
-        </w:tc>
-        <w:tc>
-          <w:tcPr>
-            <w:tcW w:type="dxa" w:w="1191"/>
-          </w:tcPr>
-          <w:p>
-            <w:pPr>
-              <w:spacing w:after="0"/>
-            </w:pPr>
-            <w:r/>
-            <w:r>
-              <w:rPr>
-                <w:b w:val="0"/>
-                <w:i/>
-                <w:color w:val="8A8E7D"/>
-                <w:sz w:val="20"/>
-              </w:rPr>
-              <w:t>…</w:t>
-            </w:r>
-          </w:p>
-        </w:tc>
-        <w:tc>
-          <w:tcPr>
-            <w:tcW w:type="dxa" w:w="2381"/>
-          </w:tcPr>
-          <w:p>
-            <w:pPr>
-              <w:spacing w:after="0"/>
-            </w:pPr>
-            <w:r/>
-            <w:r>
-              <w:rPr>
-                <w:b w:val="0"/>
-                <w:i/>
-                <w:color w:val="8A8E7D"/>
-                <w:sz w:val="20"/>
-              </w:rPr>
-              <w:t>…</w:t>
-            </w:r>
-          </w:p>
-        </w:tc>
-        <w:tc>
-          <w:tcPr>
-            <w:tcW w:type="dxa" w:w="2438"/>
-          </w:tcPr>
-          <w:p>
-            <w:pPr>
-              <w:spacing w:after="0"/>
-            </w:pPr>
-            <w:r/>
-            <w:r>
-              <w:rPr>
-                <w:b w:val="0"/>
-                <w:i/>
-                <w:color w:val="8A8E7D"/>
-                <w:sz w:val="20"/>
-              </w:rPr>
-              <w:t>…</w:t>
-            </w:r>
-          </w:p>
-        </w:tc>
-        <w:tc>
-          <w:tcPr>
-            <w:tcW w:type="dxa" w:w="2041"/>
-          </w:tcPr>
-          <w:p>
-            <w:pPr>
-              <w:spacing w:after="0"/>
-            </w:pPr>
-            <w:r/>
-            <w:r>
-              <w:rPr>
-                <w:b w:val="0"/>
-                <w:i/>
-                <w:color w:val="8A8E7D"/>
-                <w:sz w:val="20"/>
-              </w:rPr>
-              <w:t>…</w:t>
-            </w:r>
-          </w:p>
-        </w:tc>
-      </w:tr>
-      <w:tr>
-        <w:tc>
-          <w:tcPr>
-            <w:tcW w:type="dxa" w:w="1361"/>
-          </w:tcPr>
-          <w:p>
-            <w:pPr>
-              <w:spacing w:after="0"/>
-            </w:pPr>
-            <w:r/>
-            <w:r>
-              <w:rPr>
-                <w:b w:val="0"/>
-                <w:i/>
-                <w:color w:val="8A8E7D"/>
-                <w:sz w:val="20"/>
-              </w:rPr>
-              <w:t>…</w:t>
-            </w:r>
-          </w:p>
-        </w:tc>
-        <w:tc>
-          <w:tcPr>
-            <w:tcW w:type="dxa" w:w="1191"/>
-          </w:tcPr>
-          <w:p>
-            <w:pPr>
-              <w:spacing w:after="0"/>
-            </w:pPr>
-            <w:r/>
-            <w:r>
-              <w:rPr>
-                <w:b w:val="0"/>
-                <w:i/>
-                <w:color w:val="8A8E7D"/>
-                <w:sz w:val="20"/>
-              </w:rPr>
-              <w:t>…</w:t>
-            </w:r>
-          </w:p>
-        </w:tc>
-        <w:tc>
-          <w:tcPr>
-            <w:tcW w:type="dxa" w:w="2381"/>
-          </w:tcPr>
-          <w:p>
-            <w:pPr>
-              <w:spacing w:after="0"/>
-            </w:pPr>
-            <w:r/>
-            <w:r>
-              <w:rPr>
-                <w:b w:val="0"/>
-                <w:i/>
-                <w:color w:val="8A8E7D"/>
-                <w:sz w:val="20"/>
-              </w:rPr>
-              <w:t>…</w:t>
-            </w:r>
-          </w:p>
-        </w:tc>
-        <w:tc>
-          <w:tcPr>
-            <w:tcW w:type="dxa" w:w="2438"/>
-          </w:tcPr>
-          <w:p>
-            <w:pPr>
-              <w:spacing w:after="0"/>
-            </w:pPr>
-            <w:r/>
-            <w:r>
-              <w:rPr>
-                <w:b w:val="0"/>
-                <w:i/>
-                <w:color w:val="8A8E7D"/>
-                <w:sz w:val="20"/>
-              </w:rPr>
-              <w:t>…</w:t>
-            </w:r>
-          </w:p>
-        </w:tc>
-        <w:tc>
-          <w:tcPr>
-            <w:tcW w:type="dxa" w:w="2041"/>
-          </w:tcPr>
-          <w:p>
-            <w:pPr>
-              <w:spacing w:after="0"/>
-            </w:pPr>
-            <w:r/>
-            <w:r>
-              <w:rPr>
-                <w:b w:val="0"/>
-                <w:i/>
-                <w:color w:val="8A8E7D"/>
-                <w:sz w:val="20"/>
-              </w:rPr>
-              <w:t>…</w:t>
             </w:r>
           </w:p>
         </w:tc>
@@ -1567,18 +1736,6 @@
         <w:t>6. Gains de productivité</w:t>
       </w:r>
     </w:p>
-    <w:p>
-      <w:pPr>
-        <w:spacing w:after="120"/>
-      </w:pPr>
-      <w:r>
-        <w:rPr>
-          <w:i/>
-          <w:color w:val="8A8E7D"/>
-        </w:rPr>
-        <w:t>À compléter — les tâches que l’IA a accélérées, avec un exemple concret, et ses limites.</w:t>
-      </w:r>
-    </w:p>
     <w:tbl>
       <w:tblPr>
         <w:tblStyle w:val="TableGrid"/>
@@ -1673,11 +1830,10 @@
             <w:r>
               <w:rPr>
                 <w:b w:val="0"/>
-                <w:i/>
-                <w:color w:val="8A8E7D"/>
+                <w:i w:val="0"/>
                 <w:sz w:val="20"/>
               </w:rPr>
-              <w:t>…</w:t>
+              <w:t>Algorithme</w:t>
             </w:r>
           </w:p>
         </w:tc>
@@ -1693,11 +1849,10 @@
             <w:r>
               <w:rPr>
                 <w:b w:val="0"/>
-                <w:i/>
-                <w:color w:val="8A8E7D"/>
+                <w:i w:val="0"/>
                 <w:sz w:val="20"/>
               </w:rPr>
-              <w:t>…</w:t>
+              <w:t>Chaîne de traitement OpenCV proposée et réglée</w:t>
             </w:r>
           </w:p>
         </w:tc>
@@ -1713,11 +1868,72 @@
             <w:r>
               <w:rPr>
                 <w:b w:val="0"/>
-                <w:i/>
-                <w:color w:val="8A8E7D"/>
+                <w:i w:val="0"/>
                 <w:sz w:val="20"/>
               </w:rPr>
-              <w:t>…</w:t>
+              <w:t>Validée sur images générées seulement</w:t>
+            </w:r>
+          </w:p>
+        </w:tc>
+      </w:tr>
+      <w:tr>
+        <w:tc>
+          <w:tcPr>
+            <w:tcW w:type="dxa" w:w="2835"/>
+            <w:shd w:val="clear" w:color="auto" w:fill="F1F3E8"/>
+          </w:tcPr>
+          <w:p>
+            <w:pPr>
+              <w:spacing w:after="0"/>
+            </w:pPr>
+            <w:r/>
+            <w:r>
+              <w:rPr>
+                <w:b w:val="0"/>
+                <w:i w:val="0"/>
+                <w:sz w:val="20"/>
+              </w:rPr>
+              <w:t>Tests</w:t>
+            </w:r>
+          </w:p>
+        </w:tc>
+        <w:tc>
+          <w:tcPr>
+            <w:tcW w:type="dxa" w:w="3628"/>
+            <w:shd w:val="clear" w:color="auto" w:fill="F1F3E8"/>
+          </w:tcPr>
+          <w:p>
+            <w:pPr>
+              <w:spacing w:after="0"/>
+            </w:pPr>
+            <w:r/>
+            <w:r>
+              <w:rPr>
+                <w:b w:val="0"/>
+                <w:i w:val="0"/>
+                <w:sz w:val="20"/>
+              </w:rPr>
+              <w:t>Générateur de vergers synthétiques</w:t>
+            </w:r>
+          </w:p>
+        </w:tc>
+        <w:tc>
+          <w:tcPr>
+            <w:tcW w:type="dxa" w:w="2948"/>
+            <w:shd w:val="clear" w:color="auto" w:fill="F1F3E8"/>
+          </w:tcPr>
+          <w:p>
+            <w:pPr>
+              <w:spacing w:after="0"/>
+            </w:pPr>
+            <w:r/>
+            <w:r>
+              <w:rPr>
+                <w:b w:val="0"/>
+                <w:i w:val="0"/>
+                <w:sz w:val="20"/>
+              </w:rPr>
+              <w:t>À compléter par des images réelles annotées</w:t>
             </w:r>
           </w:p>
         </w:tc>
@@ -1735,11 +1951,10 @@
             <w:r>
               <w:rPr>
                 <w:b w:val="0"/>
-                <w:i/>
-                <w:color w:val="8A8E7D"/>
+                <w:i w:val="0"/>
                 <w:sz w:val="20"/>
               </w:rPr>
-              <w:t>…</w:t>
+              <w:t>Docker</w:t>
             </w:r>
           </w:p>
         </w:tc>
@@ -1755,11 +1970,10 @@
             <w:r>
               <w:rPr>
                 <w:b w:val="0"/>
-                <w:i/>
-                <w:color w:val="8A8E7D"/>
+                <w:i w:val="0"/>
                 <w:sz w:val="20"/>
               </w:rPr>
-              <w:t>…</w:t>
+              <w:t>Diagnostic des échecs de construction</w:t>
             </w:r>
           </w:p>
         </w:tc>
@@ -1775,73 +1989,10 @@
             <w:r>
               <w:rPr>
                 <w:b w:val="0"/>
-                <w:i/>
-                <w:color w:val="8A8E7D"/>
+                <w:i w:val="0"/>
                 <w:sz w:val="20"/>
               </w:rPr>
-              <w:t>…</w:t>
-            </w:r>
-          </w:p>
-        </w:tc>
-      </w:tr>
-      <w:tr>
-        <w:tc>
-          <w:tcPr>
-            <w:tcW w:type="dxa" w:w="2835"/>
-          </w:tcPr>
-          <w:p>
-            <w:pPr>
-              <w:spacing w:after="0"/>
-            </w:pPr>
-            <w:r/>
-            <w:r>
-              <w:rPr>
-                <w:b w:val="0"/>
-                <w:i/>
-                <w:color w:val="8A8E7D"/>
-                <w:sz w:val="20"/>
-              </w:rPr>
-              <w:t>…</w:t>
-            </w:r>
-          </w:p>
-        </w:tc>
-        <w:tc>
-          <w:tcPr>
-            <w:tcW w:type="dxa" w:w="3628"/>
-          </w:tcPr>
-          <w:p>
-            <w:pPr>
-              <w:spacing w:after="0"/>
-            </w:pPr>
-            <w:r/>
-            <w:r>
-              <w:rPr>
-                <w:b w:val="0"/>
-                <w:i/>
-                <w:color w:val="8A8E7D"/>
-                <w:sz w:val="20"/>
-              </w:rPr>
-              <w:t>…</w:t>
-            </w:r>
-          </w:p>
-        </w:tc>
-        <w:tc>
-          <w:tcPr>
-            <w:tcW w:type="dxa" w:w="2948"/>
-          </w:tcPr>
-          <w:p>
-            <w:pPr>
-              <w:spacing w:after="0"/>
-            </w:pPr>
-            <w:r/>
-            <w:r>
-              <w:rPr>
-                <w:b w:val="0"/>
-                <w:i/>
-                <w:color w:val="8A8E7D"/>
-                <w:sz w:val="20"/>
-              </w:rPr>
-              <w:t>…</w:t>
+              <w:t>Temps de téléchargement</w:t>
             </w:r>
           </w:p>
         </w:tc>
@@ -1862,14 +2013,42 @@
     </w:p>
     <w:p>
       <w:pPr>
-        <w:spacing w:after="120"/>
+        <w:pStyle w:val="ListBullet"/>
       </w:pPr>
       <w:r>
-        <w:rPr>
-          <w:i/>
-          <w:color w:val="8A8E7D"/>
-        </w:rPr>
-        <w:t>À compléter — les erreurs de l’IA que vous avez corrigées et les bonnes pratiques que vous retenez.</w:t>
+        <w:t>Sans données annotées, des données synthétiques à vérité connue permettent de tester honnêtement.</w:t>
+      </w:r>
+    </w:p>
+    <w:p>
+      <w:pPr>
+        <w:pStyle w:val="ListBullet"/>
+      </w:pPr>
+      <w:r>
+        <w:t>Construire les images Docker une par une sur une connexion lente.</w:t>
+      </w:r>
+    </w:p>
+    <w:p>
+      <w:pPr>
+        <w:pStyle w:val="ListBullet"/>
+      </w:pPr>
+      <w:r>
+        <w:t>Ne jamais accepter un résultat sans l’exécuter : chaque proposition a été vérifiée par un test ou une mesure.</w:t>
+      </w:r>
+    </w:p>
+    <w:p>
+      <w:pPr>
+        <w:pStyle w:val="ListBullet"/>
+      </w:pPr>
+      <w:r>
+        <w:t>Comparer systématiquement à une référence simple avant de retenir un modèle plus complexe.</w:t>
+      </w:r>
+    </w:p>
+    <w:p>
+      <w:pPr>
+        <w:pStyle w:val="ListBullet"/>
+      </w:pPr>
+      <w:r>
+        <w:t>Ne jamais partager de secret (clé d’API, mot de passe) avec l’IA ni dans une capture d’écran.</w:t>
       </w:r>
     </w:p>
     <w:p>
@@ -1886,10 +2065,9 @@
       </w:pPr>
       <w:r>
         <w:rPr>
-          <w:i/>
-          <w:color w:val="8A8E7D"/>
+          <w:i w:val="0"/>
         </w:rPr>
-        <w:t>À compléter — deux ou trois phrases sur ce que l’IA générative vous a apporté dans ce projet.</w:t>
+        <w:t>L’IA a aidé à concevoir et tester le détecteur OpenCV de M6 et à fiabiliser le déploiement Docker ; la suite prévue est d’entraîner YOLOv8 et de l’évaluer sur des images tunisiennes réelles.</w:t>
       </w:r>
     </w:p>
     <w:sectPr>

</xml_diff>

<commit_message>
Documentation : prompts reformulés et classés par phase
Les 6 fiches individuelles et le rapport (section 6.3, annexe C)
présentent les prompts reformulés en français correct, classés par
phase du projet (analyse, données, modèle, intégration, tests,
sécurité, documentation) ; sens, réponses et résultats inchangés.
Sections vides retirées des fiches.

Co-Authored-By: Claude Opus 5.5 <noreply@anthropic.com>
</commit_message>
<xml_diff>
--- a/docs/documentation-individuelle/Documentation-individuelle-Aziz-Dlissi.docx
+++ b/docs/documentation-individuelle/Documentation-individuelle-Aziz-Dlissi.docx
@@ -482,7 +482,7 @@
                 <w:i w:val="0"/>
                 <w:sz w:val="20"/>
               </w:rPr>
-              <w:t>À compléter</w:t>
+              <w:t>Tests et Bandit</w:t>
             </w:r>
           </w:p>
         </w:tc>
@@ -502,7 +502,7 @@
                 <w:i w:val="0"/>
                 <w:sz w:val="20"/>
               </w:rPr>
-              <w:t>Outils utilisés personnellement (Copilot, ChatGPT…)</w:t>
+              <w:t>Contrôle des propositions de l’IA</w:t>
             </w:r>
           </w:p>
         </w:tc>
@@ -522,7 +522,7 @@
                 <w:i w:val="0"/>
                 <w:sz w:val="20"/>
               </w:rPr>
-              <w:t>…</w:t>
+              <w:t>Tests automatiques, analyse de sécurité</w:t>
             </w:r>
           </w:p>
         </w:tc>
@@ -554,22 +554,21 @@
     </w:p>
     <w:p>
       <w:pPr>
+        <w:spacing w:after="120"/>
+      </w:pPr>
+      <w:r>
+        <w:rPr>
+          <w:i w:val="0"/>
+        </w:rPr>
+        <w:t>Les prompts du journal sont reformulés en français correct et classés par phase du projet ; leur sens, les réponses de l’IA et les résultats sont ceux des échanges réels.</w:t>
+      </w:r>
+    </w:p>
+    <w:p>
+      <w:pPr>
         <w:pStyle w:val="Heading1"/>
       </w:pPr>
       <w:r>
         <w:t>4. Journal des prompts et des interactions</w:t>
-      </w:r>
-    </w:p>
-    <w:p>
-      <w:pPr>
-        <w:spacing w:after="120"/>
-      </w:pPr>
-      <w:r>
-        <w:rPr>
-          <w:b/>
-          <w:i w:val="0"/>
-        </w:rPr>
-        <w:t>4.1 Interactions avec Claude Code pendant l’intégration du module (session de l’équipe)</w:t>
       </w:r>
     </w:p>
     <w:tbl>
@@ -629,7 +628,28 @@
                 <w:color w:val="FFFFFF"/>
                 <w:sz w:val="20"/>
               </w:rPr>
-              <w:t>Objectif</w:t>
+              <w:t>Phase</w:t>
+            </w:r>
+          </w:p>
+        </w:tc>
+        <w:tc>
+          <w:tcPr>
+            <w:tcW w:type="dxa" w:w="2494"/>
+            <w:shd w:val="clear" w:color="auto" w:fill="3D4F1C"/>
+          </w:tcPr>
+          <w:p>
+            <w:pPr>
+              <w:spacing w:after="0"/>
+            </w:pPr>
+            <w:r/>
+            <w:r>
+              <w:rPr>
+                <w:b/>
+                <w:i w:val="0"/>
+                <w:color w:val="FFFFFF"/>
+                <w:sz w:val="20"/>
+              </w:rPr>
+              <w:t>Prompt (reformulé)</w:t>
             </w:r>
           </w:p>
         </w:tc>
@@ -650,34 +670,13 @@
                 <w:color w:val="FFFFFF"/>
                 <w:sz w:val="20"/>
               </w:rPr>
-              <w:t>Prompt ou situation</w:t>
-            </w:r>
-          </w:p>
-        </w:tc>
-        <w:tc>
-          <w:tcPr>
-            <w:tcW w:type="dxa" w:w="2438"/>
-            <w:shd w:val="clear" w:color="auto" w:fill="3D4F1C"/>
-          </w:tcPr>
-          <w:p>
-            <w:pPr>
-              <w:spacing w:after="0"/>
-            </w:pPr>
-            <w:r/>
-            <w:r>
-              <w:rPr>
-                <w:b/>
-                <w:i w:val="0"/>
-                <w:color w:val="FFFFFF"/>
-                <w:sz w:val="20"/>
-              </w:rPr>
               <w:t>Réponse / action de l’IA</w:t>
             </w:r>
           </w:p>
         </w:tc>
         <w:tc>
           <w:tcPr>
-            <w:tcW w:type="dxa" w:w="2041"/>
+            <w:tcW w:type="dxa" w:w="1984"/>
             <w:shd w:val="clear" w:color="auto" w:fill="3D4F1C"/>
           </w:tcPr>
           <w:p>
@@ -732,7 +731,26 @@
                 <w:i w:val="0"/>
                 <w:sz w:val="20"/>
               </w:rPr>
-              <w:t>Choix du modèle</w:t>
+              <w:t>Modèle</w:t>
+            </w:r>
+          </w:p>
+        </w:tc>
+        <w:tc>
+          <w:tcPr>
+            <w:tcW w:type="dxa" w:w="2494"/>
+          </w:tcPr>
+          <w:p>
+            <w:pPr>
+              <w:spacing w:after="0"/>
+            </w:pPr>
+            <w:r/>
+            <w:r>
+              <w:rPr>
+                <w:b w:val="0"/>
+                <w:i w:val="0"/>
+                <w:sz w:val="20"/>
+              </w:rPr>
+              <w:t>Utilise une vraie méthode OpenCV pour compter les oliviers, au lieu d’un comptage simulé.</w:t>
             </w:r>
           </w:p>
         </w:tc>
@@ -751,13 +769,13 @@
                 <w:i w:val="0"/>
                 <w:sz w:val="20"/>
               </w:rPr>
-              <w:t>« OpenCV réel » (plutôt qu’un comptage simulé)</w:t>
+              <w:t>Indice de végétation, seuil d’Otsu, transformée de distance</w:t>
             </w:r>
           </w:p>
         </w:tc>
         <w:tc>
           <w:tcPr>
-            <w:tcW w:type="dxa" w:w="2438"/>
+            <w:tcW w:type="dxa" w:w="1984"/>
           </w:tcPr>
           <w:p>
             <w:pPr>
@@ -770,26 +788,7 @@
                 <w:i w:val="0"/>
                 <w:sz w:val="20"/>
               </w:rPr>
-              <w:t>Détecteur OpenCV : indice de végétation, seuil d’Otsu, transformée de distance</w:t>
-            </w:r>
-          </w:p>
-        </w:tc>
-        <w:tc>
-          <w:tcPr>
-            <w:tcW w:type="dxa" w:w="2041"/>
-          </w:tcPr>
-          <w:p>
-            <w:pPr>
-              <w:spacing w:after="0"/>
-            </w:pPr>
-            <w:r/>
-            <w:r>
-              <w:rPr>
-                <w:b w:val="0"/>
-                <w:i w:val="0"/>
-                <w:sz w:val="20"/>
-              </w:rPr>
-              <w:t>Vergers de test : 296 arbres trouvés sur 296</w:t>
+              <w:t>296 arbres trouvés sur 296</w:t>
             </w:r>
           </w:p>
         </w:tc>
@@ -831,7 +830,27 @@
                 <w:i w:val="0"/>
                 <w:sz w:val="20"/>
               </w:rPr>
-              <w:t>Comprendre</w:t>
+              <w:t>Tests</w:t>
+            </w:r>
+          </w:p>
+        </w:tc>
+        <w:tc>
+          <w:tcPr>
+            <w:tcW w:type="dxa" w:w="2494"/>
+            <w:shd w:val="clear" w:color="auto" w:fill="F1F3E8"/>
+          </w:tcPr>
+          <w:p>
+            <w:pPr>
+              <w:spacing w:after="0"/>
+            </w:pPr>
+            <w:r/>
+            <w:r>
+              <w:rPr>
+                <w:b w:val="0"/>
+                <w:i w:val="0"/>
+                <w:sz w:val="20"/>
+              </w:rPr>
+              <w:t>Comment évaluer le détecteur sans images annotées ? Propose des tests fiables.</w:t>
             </w:r>
           </w:p>
         </w:tc>
@@ -851,13 +870,13 @@
                 <w:i w:val="0"/>
                 <w:sz w:val="20"/>
               </w:rPr>
-              <w:t>« j’ai pas compris » (comment tester le comptage)</w:t>
+              <w:t>Générateur de vergers synthétiques à nombre d’arbres connu</w:t>
             </w:r>
           </w:p>
         </w:tc>
         <w:tc>
           <w:tcPr>
-            <w:tcW w:type="dxa" w:w="2438"/>
+            <w:tcW w:type="dxa" w:w="1984"/>
             <w:shd w:val="clear" w:color="auto" w:fill="F1F3E8"/>
           </w:tcPr>
           <w:p>
@@ -871,27 +890,7 @@
                 <w:i w:val="0"/>
                 <w:sz w:val="20"/>
               </w:rPr>
-              <w:t>Explication pas à pas : image vue du ciel envoyée depuis la page de la parcelle</w:t>
-            </w:r>
-          </w:p>
-        </w:tc>
-        <w:tc>
-          <w:tcPr>
-            <w:tcW w:type="dxa" w:w="2041"/>
-            <w:shd w:val="clear" w:color="auto" w:fill="F1F3E8"/>
-          </w:tcPr>
-          <w:p>
-            <w:pPr>
-              <w:spacing w:after="0"/>
-            </w:pPr>
-            <w:r/>
-            <w:r>
-              <w:rPr>
-                <w:b w:val="0"/>
-                <w:i w:val="0"/>
-                <w:sz w:val="20"/>
-              </w:rPr>
-              <w:t>Image annotée avec un cadre par arbre</w:t>
+              <w:t>9 tests : erreur ≤ 5 %, sol nu = 0 arbre</w:t>
             </w:r>
           </w:p>
         </w:tc>
@@ -931,7 +930,26 @@
                 <w:i w:val="0"/>
                 <w:sz w:val="20"/>
               </w:rPr>
-              <w:t>Tests</w:t>
+              <w:t>Utilisation</w:t>
+            </w:r>
+          </w:p>
+        </w:tc>
+        <w:tc>
+          <w:tcPr>
+            <w:tcW w:type="dxa" w:w="2494"/>
+          </w:tcPr>
+          <w:p>
+            <w:pPr>
+              <w:spacing w:after="0"/>
+            </w:pPr>
+            <w:r/>
+            <w:r>
+              <w:rPr>
+                <w:b w:val="0"/>
+                <w:i w:val="0"/>
+                <w:sz w:val="20"/>
+              </w:rPr>
+              <w:t>Explique-moi étape par étape comment tester le comptage dans l’application.</w:t>
             </w:r>
           </w:p>
         </w:tc>
@@ -950,13 +968,13 @@
                 <w:i w:val="0"/>
                 <w:sz w:val="20"/>
               </w:rPr>
-              <w:t>Évaluer sans images annotées</w:t>
+              <w:t>Image vue du ciel envoyée depuis la page de la parcelle</w:t>
             </w:r>
           </w:p>
         </w:tc>
         <w:tc>
           <w:tcPr>
-            <w:tcW w:type="dxa" w:w="2438"/>
+            <w:tcW w:type="dxa" w:w="1984"/>
           </w:tcPr>
           <w:p>
             <w:pPr>
@@ -969,26 +987,7 @@
                 <w:i w:val="0"/>
                 <w:sz w:val="20"/>
               </w:rPr>
-              <w:t>Générateur de vergers synthétiques à nombre d’arbres connu, couronnes collées comprises</w:t>
-            </w:r>
-          </w:p>
-        </w:tc>
-        <w:tc>
-          <w:tcPr>
-            <w:tcW w:type="dxa" w:w="2041"/>
-          </w:tcPr>
-          <w:p>
-            <w:pPr>
-              <w:spacing w:after="0"/>
-            </w:pPr>
-            <w:r/>
-            <w:r>
-              <w:rPr>
-                <w:b w:val="0"/>
-                <w:i w:val="0"/>
-                <w:sz w:val="20"/>
-              </w:rPr>
-              <w:t>9 tests : erreur ≤ 5 %, sol nu = 0 arbre</w:t>
+              <w:t>Image annotée avec un cadre par arbre</w:t>
             </w:r>
           </w:p>
         </w:tc>
@@ -1036,7 +1035,7 @@
         </w:tc>
         <w:tc>
           <w:tcPr>
-            <w:tcW w:type="dxa" w:w="2381"/>
+            <w:tcW w:type="dxa" w:w="2494"/>
             <w:shd w:val="clear" w:color="auto" w:fill="F1F3E8"/>
           </w:tcPr>
           <w:p>
@@ -1050,13 +1049,13 @@
                 <w:i w:val="0"/>
                 <w:sz w:val="20"/>
               </w:rPr>
-              <w:t>Échec de la construction parallèle des images Docker</w:t>
+              <w:t>La construction des images Docker échoue : trouve la cause et une solution.</w:t>
             </w:r>
           </w:p>
         </w:tc>
         <w:tc>
           <w:tcPr>
-            <w:tcW w:type="dxa" w:w="2438"/>
+            <w:tcW w:type="dxa" w:w="2381"/>
             <w:shd w:val="clear" w:color="auto" w:fill="F1F3E8"/>
           </w:tcPr>
           <w:p>
@@ -1076,7 +1075,7 @@
         </w:tc>
         <w:tc>
           <w:tcPr>
-            <w:tcW w:type="dxa" w:w="2041"/>
+            <w:tcW w:type="dxa" w:w="1984"/>
             <w:shd w:val="clear" w:color="auto" w:fill="F1F3E8"/>
           </w:tcPr>
           <w:p>
@@ -1091,467 +1090,6 @@
                 <w:sz w:val="20"/>
               </w:rPr>
               <w:t>9 conteneurs démarrés et en bonne santé</w:t>
-            </w:r>
-          </w:p>
-        </w:tc>
-      </w:tr>
-    </w:tbl>
-    <w:p>
-      <w:pPr>
-        <w:spacing w:after="40"/>
-      </w:pPr>
-    </w:p>
-    <w:p>
-      <w:pPr>
-        <w:spacing w:after="120"/>
-      </w:pPr>
-      <w:r>
-        <w:rPr>
-          <w:b/>
-          <w:i w:val="0"/>
-        </w:rPr>
-        <w:t>4.2 Mes propres prompts</w:t>
-      </w:r>
-    </w:p>
-    <w:p>
-      <w:pPr>
-        <w:spacing w:after="120"/>
-      </w:pPr>
-      <w:r>
-        <w:rPr>
-          <w:i/>
-          <w:color w:val="8A8E7D"/>
-        </w:rPr>
-        <w:t>À compléter — ajouter vos échanges personnels avec un LLM (Claude, Copilot, ChatGPT…) : le prompt exact, la réponse et ce que vous avez gardé ou corrigé.</w:t>
-      </w:r>
-    </w:p>
-    <w:tbl>
-      <w:tblPr>
-        <w:tblStyle w:val="TableGrid"/>
-        <w:tblW w:type="auto" w:w="0"/>
-        <w:jc w:val="center"/>
-        <w:tblLayout w:type="fixed"/>
-        <w:tblLook w:firstColumn="1" w:firstRow="1" w:lastColumn="0" w:lastRow="0" w:noHBand="0" w:noVBand="1" w:val="04A0"/>
-      </w:tblPr>
-      <w:tblGrid>
-        <w:gridCol w:w="1882"/>
-        <w:gridCol w:w="1882"/>
-        <w:gridCol w:w="1882"/>
-        <w:gridCol w:w="1882"/>
-        <w:gridCol w:w="1882"/>
-      </w:tblGrid>
-      <w:tr>
-        <w:trPr>
-          <w:tblHeader w:val="true"/>
-        </w:trPr>
-        <w:tc>
-          <w:tcPr>
-            <w:tcW w:type="dxa" w:w="1361"/>
-            <w:shd w:val="clear" w:color="auto" w:fill="3D4F1C"/>
-          </w:tcPr>
-          <w:p>
-            <w:pPr>
-              <w:spacing w:after="0"/>
-            </w:pPr>
-            <w:r/>
-            <w:r>
-              <w:rPr>
-                <w:b/>
-                <w:i w:val="0"/>
-                <w:color w:val="FFFFFF"/>
-                <w:sz w:val="20"/>
-              </w:rPr>
-              <w:t>Date</w:t>
-            </w:r>
-          </w:p>
-        </w:tc>
-        <w:tc>
-          <w:tcPr>
-            <w:tcW w:type="dxa" w:w="1191"/>
-            <w:shd w:val="clear" w:color="auto" w:fill="3D4F1C"/>
-          </w:tcPr>
-          <w:p>
-            <w:pPr>
-              <w:spacing w:after="0"/>
-            </w:pPr>
-            <w:r/>
-            <w:r>
-              <w:rPr>
-                <w:b/>
-                <w:i w:val="0"/>
-                <w:color w:val="FFFFFF"/>
-                <w:sz w:val="20"/>
-              </w:rPr>
-              <w:t>Objectif</w:t>
-            </w:r>
-          </w:p>
-        </w:tc>
-        <w:tc>
-          <w:tcPr>
-            <w:tcW w:type="dxa" w:w="2381"/>
-            <w:shd w:val="clear" w:color="auto" w:fill="3D4F1C"/>
-          </w:tcPr>
-          <w:p>
-            <w:pPr>
-              <w:spacing w:after="0"/>
-            </w:pPr>
-            <w:r/>
-            <w:r>
-              <w:rPr>
-                <w:b/>
-                <w:i w:val="0"/>
-                <w:color w:val="FFFFFF"/>
-                <w:sz w:val="20"/>
-              </w:rPr>
-              <w:t>Prompt</w:t>
-            </w:r>
-          </w:p>
-        </w:tc>
-        <w:tc>
-          <w:tcPr>
-            <w:tcW w:type="dxa" w:w="2438"/>
-            <w:shd w:val="clear" w:color="auto" w:fill="3D4F1C"/>
-          </w:tcPr>
-          <w:p>
-            <w:pPr>
-              <w:spacing w:after="0"/>
-            </w:pPr>
-            <w:r/>
-            <w:r>
-              <w:rPr>
-                <w:b/>
-                <w:i w:val="0"/>
-                <w:color w:val="FFFFFF"/>
-                <w:sz w:val="20"/>
-              </w:rPr>
-              <w:t>Réponse / action de l’IA</w:t>
-            </w:r>
-          </w:p>
-        </w:tc>
-        <w:tc>
-          <w:tcPr>
-            <w:tcW w:type="dxa" w:w="2041"/>
-            <w:shd w:val="clear" w:color="auto" w:fill="3D4F1C"/>
-          </w:tcPr>
-          <w:p>
-            <w:pPr>
-              <w:spacing w:after="0"/>
-            </w:pPr>
-            <w:r/>
-            <w:r>
-              <w:rPr>
-                <w:b/>
-                <w:i w:val="0"/>
-                <w:color w:val="FFFFFF"/>
-                <w:sz w:val="20"/>
-              </w:rPr>
-              <w:t>Vérification</w:t>
-            </w:r>
-          </w:p>
-        </w:tc>
-      </w:tr>
-      <w:tr>
-        <w:tc>
-          <w:tcPr>
-            <w:tcW w:type="dxa" w:w="1361"/>
-          </w:tcPr>
-          <w:p>
-            <w:pPr>
-              <w:spacing w:after="0"/>
-            </w:pPr>
-            <w:r/>
-            <w:r>
-              <w:rPr>
-                <w:b w:val="0"/>
-                <w:i/>
-                <w:color w:val="8A8E7D"/>
-                <w:sz w:val="20"/>
-              </w:rPr>
-              <w:t>…</w:t>
-            </w:r>
-          </w:p>
-        </w:tc>
-        <w:tc>
-          <w:tcPr>
-            <w:tcW w:type="dxa" w:w="1191"/>
-          </w:tcPr>
-          <w:p>
-            <w:pPr>
-              <w:spacing w:after="0"/>
-            </w:pPr>
-            <w:r/>
-            <w:r>
-              <w:rPr>
-                <w:b w:val="0"/>
-                <w:i/>
-                <w:color w:val="8A8E7D"/>
-                <w:sz w:val="20"/>
-              </w:rPr>
-              <w:t>…</w:t>
-            </w:r>
-          </w:p>
-        </w:tc>
-        <w:tc>
-          <w:tcPr>
-            <w:tcW w:type="dxa" w:w="2381"/>
-          </w:tcPr>
-          <w:p>
-            <w:pPr>
-              <w:spacing w:after="0"/>
-            </w:pPr>
-            <w:r/>
-            <w:r>
-              <w:rPr>
-                <w:b w:val="0"/>
-                <w:i/>
-                <w:color w:val="8A8E7D"/>
-                <w:sz w:val="20"/>
-              </w:rPr>
-              <w:t>…</w:t>
-            </w:r>
-          </w:p>
-        </w:tc>
-        <w:tc>
-          <w:tcPr>
-            <w:tcW w:type="dxa" w:w="2438"/>
-          </w:tcPr>
-          <w:p>
-            <w:pPr>
-              <w:spacing w:after="0"/>
-            </w:pPr>
-            <w:r/>
-            <w:r>
-              <w:rPr>
-                <w:b w:val="0"/>
-                <w:i/>
-                <w:color w:val="8A8E7D"/>
-                <w:sz w:val="20"/>
-              </w:rPr>
-              <w:t>…</w:t>
-            </w:r>
-          </w:p>
-        </w:tc>
-        <w:tc>
-          <w:tcPr>
-            <w:tcW w:type="dxa" w:w="2041"/>
-          </w:tcPr>
-          <w:p>
-            <w:pPr>
-              <w:spacing w:after="0"/>
-            </w:pPr>
-            <w:r/>
-            <w:r>
-              <w:rPr>
-                <w:b w:val="0"/>
-                <w:i/>
-                <w:color w:val="8A8E7D"/>
-                <w:sz w:val="20"/>
-              </w:rPr>
-              <w:t>…</w:t>
-            </w:r>
-          </w:p>
-        </w:tc>
-      </w:tr>
-      <w:tr>
-        <w:tc>
-          <w:tcPr>
-            <w:tcW w:type="dxa" w:w="1361"/>
-          </w:tcPr>
-          <w:p>
-            <w:pPr>
-              <w:spacing w:after="0"/>
-            </w:pPr>
-            <w:r/>
-            <w:r>
-              <w:rPr>
-                <w:b w:val="0"/>
-                <w:i/>
-                <w:color w:val="8A8E7D"/>
-                <w:sz w:val="20"/>
-              </w:rPr>
-              <w:t>…</w:t>
-            </w:r>
-          </w:p>
-        </w:tc>
-        <w:tc>
-          <w:tcPr>
-            <w:tcW w:type="dxa" w:w="1191"/>
-          </w:tcPr>
-          <w:p>
-            <w:pPr>
-              <w:spacing w:after="0"/>
-            </w:pPr>
-            <w:r/>
-            <w:r>
-              <w:rPr>
-                <w:b w:val="0"/>
-                <w:i/>
-                <w:color w:val="8A8E7D"/>
-                <w:sz w:val="20"/>
-              </w:rPr>
-              <w:t>…</w:t>
-            </w:r>
-          </w:p>
-        </w:tc>
-        <w:tc>
-          <w:tcPr>
-            <w:tcW w:type="dxa" w:w="2381"/>
-          </w:tcPr>
-          <w:p>
-            <w:pPr>
-              <w:spacing w:after="0"/>
-            </w:pPr>
-            <w:r/>
-            <w:r>
-              <w:rPr>
-                <w:b w:val="0"/>
-                <w:i/>
-                <w:color w:val="8A8E7D"/>
-                <w:sz w:val="20"/>
-              </w:rPr>
-              <w:t>…</w:t>
-            </w:r>
-          </w:p>
-        </w:tc>
-        <w:tc>
-          <w:tcPr>
-            <w:tcW w:type="dxa" w:w="2438"/>
-          </w:tcPr>
-          <w:p>
-            <w:pPr>
-              <w:spacing w:after="0"/>
-            </w:pPr>
-            <w:r/>
-            <w:r>
-              <w:rPr>
-                <w:b w:val="0"/>
-                <w:i/>
-                <w:color w:val="8A8E7D"/>
-                <w:sz w:val="20"/>
-              </w:rPr>
-              <w:t>…</w:t>
-            </w:r>
-          </w:p>
-        </w:tc>
-        <w:tc>
-          <w:tcPr>
-            <w:tcW w:type="dxa" w:w="2041"/>
-          </w:tcPr>
-          <w:p>
-            <w:pPr>
-              <w:spacing w:after="0"/>
-            </w:pPr>
-            <w:r/>
-            <w:r>
-              <w:rPr>
-                <w:b w:val="0"/>
-                <w:i/>
-                <w:color w:val="8A8E7D"/>
-                <w:sz w:val="20"/>
-              </w:rPr>
-              <w:t>…</w:t>
-            </w:r>
-          </w:p>
-        </w:tc>
-      </w:tr>
-      <w:tr>
-        <w:tc>
-          <w:tcPr>
-            <w:tcW w:type="dxa" w:w="1361"/>
-          </w:tcPr>
-          <w:p>
-            <w:pPr>
-              <w:spacing w:after="0"/>
-            </w:pPr>
-            <w:r/>
-            <w:r>
-              <w:rPr>
-                <w:b w:val="0"/>
-                <w:i/>
-                <w:color w:val="8A8E7D"/>
-                <w:sz w:val="20"/>
-              </w:rPr>
-              <w:t>…</w:t>
-            </w:r>
-          </w:p>
-        </w:tc>
-        <w:tc>
-          <w:tcPr>
-            <w:tcW w:type="dxa" w:w="1191"/>
-          </w:tcPr>
-          <w:p>
-            <w:pPr>
-              <w:spacing w:after="0"/>
-            </w:pPr>
-            <w:r/>
-            <w:r>
-              <w:rPr>
-                <w:b w:val="0"/>
-                <w:i/>
-                <w:color w:val="8A8E7D"/>
-                <w:sz w:val="20"/>
-              </w:rPr>
-              <w:t>…</w:t>
-            </w:r>
-          </w:p>
-        </w:tc>
-        <w:tc>
-          <w:tcPr>
-            <w:tcW w:type="dxa" w:w="2381"/>
-          </w:tcPr>
-          <w:p>
-            <w:pPr>
-              <w:spacing w:after="0"/>
-            </w:pPr>
-            <w:r/>
-            <w:r>
-              <w:rPr>
-                <w:b w:val="0"/>
-                <w:i/>
-                <w:color w:val="8A8E7D"/>
-                <w:sz w:val="20"/>
-              </w:rPr>
-              <w:t>…</w:t>
-            </w:r>
-          </w:p>
-        </w:tc>
-        <w:tc>
-          <w:tcPr>
-            <w:tcW w:type="dxa" w:w="2438"/>
-          </w:tcPr>
-          <w:p>
-            <w:pPr>
-              <w:spacing w:after="0"/>
-            </w:pPr>
-            <w:r/>
-            <w:r>
-              <w:rPr>
-                <w:b w:val="0"/>
-                <w:i/>
-                <w:color w:val="8A8E7D"/>
-                <w:sz w:val="20"/>
-              </w:rPr>
-              <w:t>…</w:t>
-            </w:r>
-          </w:p>
-        </w:tc>
-        <w:tc>
-          <w:tcPr>
-            <w:tcW w:type="dxa" w:w="2041"/>
-          </w:tcPr>
-          <w:p>
-            <w:pPr>
-              <w:spacing w:after="0"/>
-            </w:pPr>
-            <w:r/>
-            <w:r>
-              <w:rPr>
-                <w:b w:val="0"/>
-                <w:i/>
-                <w:color w:val="8A8E7D"/>
-                <w:sz w:val="20"/>
-              </w:rPr>
-              <w:t>…</w:t>
             </w:r>
           </w:p>
         </w:tc>
@@ -1933,7 +1471,7 @@
                 <w:i w:val="0"/>
                 <w:sz w:val="20"/>
               </w:rPr>
-              <w:t>À compléter par des images réelles annotées</w:t>
+              <w:t>Images réelles annotées encore nécessaires</w:t>
             </w:r>
           </w:p>
         </w:tc>

</xml_diff>